<commit_message>
docs: consolidate bizplan drafts and add revenue projection SOT
- Remove obsolete draft files (final.md, final_3.md, draft_cc/codex_v2.md, fill_docx.py)
- Add revenue-projection_cc생성.md as new P&L SOT
- Replace revenue-model.md with revenue-projection SOT
- Update bizplan DOCX files with BM/SOM revisions
- Sync AGENTS.md

Co-Authored-By: Claude Opus 4.6 (1M context) <noreply@anthropic.com>
</commit_message>
<xml_diff>
--- a/docs/예창패 실제 제풀용/claudecode/2026년 예비창업패키지 사업계획서_페르소닉AI_보충자료_codex_BM수정.docx
+++ b/docs/예창패 실제 제풀용/claudecode/2026년 예비창업패키지 사업계획서_페르소닉AI_보충자료_codex_BM수정.docx
@@ -6,6 +6,7 @@
       <w:pPr>
         <w:pStyle w:val="1"/>
         <w:rPr>
+          <w:rFonts w:ascii="맑은 고딕" w:eastAsia="맑은 고딕" w:hAnsi="맑은 고딕"/>
           <w:lang w:eastAsia="ko-KR"/>
         </w:rPr>
       </w:pPr>
@@ -13,6 +14,7 @@
       <w:proofErr w:type="spellStart"/>
       <w:r>
         <w:rPr>
+          <w:rFonts w:ascii="맑은 고딕" w:eastAsia="맑은 고딕" w:hAnsi="맑은 고딕"/>
           <w:lang w:eastAsia="ko-KR"/>
         </w:rPr>
         <w:t>페르소닉</w:t>
@@ -20,27 +22,10 @@
       <w:proofErr w:type="spellEnd"/>
       <w:r>
         <w:rPr>
+          <w:rFonts w:ascii="맑은 고딕" w:eastAsia="맑은 고딕" w:hAnsi="맑은 고딕"/>
           <w:lang w:eastAsia="ko-KR"/>
         </w:rPr>
-        <w:t xml:space="preserve"> AI — </w:t>
-      </w:r>
-      <w:r>
-        <w:rPr>
-          <w:lang w:eastAsia="ko-KR"/>
-        </w:rPr>
-        <w:t>사업계획서</w:t>
-      </w:r>
-      <w:r>
-        <w:rPr>
-          <w:lang w:eastAsia="ko-KR"/>
-        </w:rPr>
-        <w:t xml:space="preserve"> </w:t>
-      </w:r>
-      <w:r>
-        <w:rPr>
-          <w:lang w:eastAsia="ko-KR"/>
-        </w:rPr>
-        <w:t>보충자료</w:t>
+        <w:t xml:space="preserve"> AI — 사업계획서 보충자료</w:t>
       </w:r>
     </w:p>
     <w:p>
@@ -187,6 +172,7 @@
       <w:pPr>
         <w:jc w:val="center"/>
         <w:rPr>
+          <w:rFonts w:hint="eastAsia"/>
           <w:lang w:eastAsia="ko-KR"/>
         </w:rPr>
       </w:pPr>
@@ -217,6 +203,13 @@
           <w:lang w:eastAsia="ko-KR"/>
         </w:rPr>
         <w:t>시뮬레이션 현황</w:t>
+      </w:r>
+      <w:r>
+        <w:rPr>
+          <w:rFonts w:hint="eastAsia"/>
+          <w:lang w:eastAsia="ko-KR"/>
+        </w:rPr>
+        <w:t>(예시)</w:t>
       </w:r>
     </w:p>
     <w:p>
@@ -282,6 +275,13 @@
         </w:rPr>
         <w:t>그림-3 리포트 화면</w:t>
       </w:r>
+      <w:r>
+        <w:rPr>
+          <w:rFonts w:hint="eastAsia"/>
+          <w:lang w:eastAsia="ko-KR"/>
+        </w:rPr>
+        <w:t>(예시)</w:t>
+      </w:r>
     </w:p>
     <w:p>
       <w:pPr>
@@ -344,6 +344,13 @@
           <w:lang w:eastAsia="ko-KR"/>
         </w:rPr>
         <w:t>그림-4 행동 기록</w:t>
+      </w:r>
+      <w:r>
+        <w:rPr>
+          <w:rFonts w:hint="eastAsia"/>
+          <w:lang w:eastAsia="ko-KR"/>
+        </w:rPr>
+        <w:t>(예시)</w:t>
       </w:r>
     </w:p>
     <w:p>
@@ -409,50 +416,29 @@
         </w:rPr>
         <w:t>그림-5 감정 궤적</w:t>
       </w:r>
+      <w:r>
+        <w:rPr>
+          <w:rFonts w:hint="eastAsia"/>
+          <w:lang w:eastAsia="ko-KR"/>
+        </w:rPr>
+        <w:t>(예시)</w:t>
+      </w:r>
     </w:p>
     <w:p>
       <w:pPr>
         <w:pStyle w:val="21"/>
         <w:rPr>
+          <w:rFonts w:ascii="맑은 고딕" w:eastAsia="맑은 고딕" w:hAnsi="맑은 고딕"/>
           <w:lang w:eastAsia="ko-KR"/>
         </w:rPr>
       </w:pPr>
       <w:bookmarkStart w:id="1" w:name="X328b49c432db0fb5431c70f165f51b570e2ec79"/>
       <w:r>
         <w:rPr>
+          <w:rFonts w:ascii="맑은 고딕" w:eastAsia="맑은 고딕" w:hAnsi="맑은 고딕"/>
           <w:lang w:eastAsia="ko-KR"/>
         </w:rPr>
-        <w:t xml:space="preserve">1. </w:t>
-      </w:r>
-      <w:r>
-        <w:rPr>
-          <w:lang w:eastAsia="ko-KR"/>
-        </w:rPr>
-        <w:t>시장규모</w:t>
-      </w:r>
-      <w:r>
-        <w:rPr>
-          <w:lang w:eastAsia="ko-KR"/>
-        </w:rPr>
-        <w:t xml:space="preserve"> </w:t>
-      </w:r>
-      <w:r>
-        <w:rPr>
-          <w:lang w:eastAsia="ko-KR"/>
-        </w:rPr>
-        <w:t>산정</w:t>
-      </w:r>
-      <w:r>
-        <w:rPr>
-          <w:lang w:eastAsia="ko-KR"/>
-        </w:rPr>
-        <w:t xml:space="preserve"> </w:t>
-      </w:r>
-      <w:r>
-        <w:rPr>
-          <w:lang w:eastAsia="ko-KR"/>
-        </w:rPr>
-        <w:t>근거</w:t>
+        <w:t>1. 시장규모 산정 근거</w:t>
       </w:r>
     </w:p>
     <w:p>
@@ -472,55 +458,22 @@
       <w:pPr>
         <w:pStyle w:val="31"/>
         <w:rPr>
+          <w:rFonts w:ascii="맑은 고딕" w:eastAsia="맑은 고딕" w:hAnsi="맑은 고딕"/>
           <w:lang w:eastAsia="ko-KR"/>
         </w:rPr>
       </w:pPr>
       <w:bookmarkStart w:id="2" w:name="Xdc0e7fdfa9299e017b9f0a8e760d8c9a1f851e0"/>
       <w:r>
         <w:rPr>
+          <w:rFonts w:ascii="맑은 고딕" w:eastAsia="맑은 고딕" w:hAnsi="맑은 고딕"/>
           <w:lang w:eastAsia="ko-KR"/>
         </w:rPr>
-        <w:t xml:space="preserve">1-1. </w:t>
-      </w:r>
-      <w:r>
-        <w:rPr>
-          <w:lang w:eastAsia="ko-KR"/>
-        </w:rPr>
-        <w:t>왜</w:t>
-      </w:r>
-      <w:r>
-        <w:rPr>
-          <w:lang w:eastAsia="ko-KR"/>
-        </w:rPr>
-        <w:t xml:space="preserve"> TAM</w:t>
-      </w:r>
-      <w:r>
-        <w:rPr>
-          <w:lang w:eastAsia="ko-KR"/>
-        </w:rPr>
-        <w:t>을</w:t>
-      </w:r>
-      <w:r>
-        <w:rPr>
-          <w:lang w:eastAsia="ko-KR"/>
-        </w:rPr>
-        <w:t xml:space="preserve"> </w:t>
-      </w:r>
-      <w:r>
-        <w:rPr>
-          <w:lang w:eastAsia="ko-KR"/>
-        </w:rPr>
-        <w:t>좁게</w:t>
-      </w:r>
-      <w:r>
-        <w:rPr>
-          <w:lang w:eastAsia="ko-KR"/>
-        </w:rPr>
-        <w:t xml:space="preserve"> </w:t>
+        <w:t xml:space="preserve">1-1. 왜 TAM을 좁게 </w:t>
       </w:r>
       <w:proofErr w:type="gramStart"/>
       <w:r>
         <w:rPr>
+          <w:rFonts w:ascii="맑은 고딕" w:eastAsia="맑은 고딕" w:hAnsi="맑은 고딕"/>
           <w:lang w:eastAsia="ko-KR"/>
         </w:rPr>
         <w:t>잡았나</w:t>
@@ -538,37 +491,54 @@
         </w:rPr>
       </w:pPr>
       <w:proofErr w:type="spellStart"/>
+      <w:r>
+        <w:rPr>
+          <w:lang w:eastAsia="ko-KR"/>
+        </w:rPr>
+        <w:t>페르소닉</w:t>
+      </w:r>
       <w:proofErr w:type="spellEnd"/>
-      <w:proofErr w:type="gramStart"/>
-      <w:proofErr w:type="gramEnd"/>
       <w:r>
         <w:rPr>
-          <w:rFonts w:ascii="맑은 고딕" w:hAnsi="맑은 고딕" w:eastAsia="맑은 고딕"/>
-          <w:b w:val="0"/>
-          <w:sz w:val="20"/>
-        </w:rPr>
-        <w:t>페르소닉 AI는 리서치 SaaS 회사다. 그래서 TAM도 현재 이미 소프트웨어로 구매되는 시장만 포함했다.</w:t>
+          <w:lang w:eastAsia="ko-KR"/>
+        </w:rPr>
+        <w:t xml:space="preserve"> AI는 리서치 SaaS 회사다. 그래서 TAM도 현재 이미 소프트웨어로 구매되는 시장만 포함했다.</w:t>
       </w:r>
     </w:p>
     <w:p>
       <w:pPr>
         <w:pStyle w:val="31"/>
+        <w:rPr>
+          <w:rFonts w:ascii="맑은 고딕" w:eastAsia="맑은 고딕" w:hAnsi="맑은 고딕"/>
+        </w:rPr>
       </w:pPr>
       <w:bookmarkStart w:id="3" w:name="Xc9afde7c929f9be63d0dcf9b3ed40f932a3480b"/>
       <w:bookmarkEnd w:id="2"/>
       <w:r>
+        <w:rPr>
+          <w:rFonts w:ascii="맑은 고딕" w:eastAsia="맑은 고딕" w:hAnsi="맑은 고딕"/>
+        </w:rPr>
         <w:t xml:space="preserve">1-2. TAM </w:t>
       </w:r>
       <w:proofErr w:type="spellStart"/>
       <w:r>
+        <w:rPr>
+          <w:rFonts w:ascii="맑은 고딕" w:eastAsia="맑은 고딕" w:hAnsi="맑은 고딕"/>
+        </w:rPr>
         <w:t>세부</w:t>
       </w:r>
       <w:proofErr w:type="spellEnd"/>
       <w:r>
+        <w:rPr>
+          <w:rFonts w:ascii="맑은 고딕" w:eastAsia="맑은 고딕" w:hAnsi="맑은 고딕"/>
+        </w:rPr>
         <w:t xml:space="preserve"> </w:t>
       </w:r>
       <w:proofErr w:type="spellStart"/>
       <w:r>
+        <w:rPr>
+          <w:rFonts w:ascii="맑은 고딕" w:eastAsia="맑은 고딕" w:hAnsi="맑은 고딕"/>
+        </w:rPr>
         <w:t>산출</w:t>
       </w:r>
       <w:proofErr w:type="spellEnd"/>
@@ -588,10 +558,10 @@
         <w:tblLook w:val="0020" w:firstRow="1" w:lastRow="0" w:firstColumn="0" w:lastColumn="0" w:noHBand="0" w:noVBand="0"/>
       </w:tblPr>
       <w:tblGrid>
-        <w:gridCol w:w="2000"/>
-        <w:gridCol w:w="2558"/>
-        <w:gridCol w:w="1261"/>
-        <w:gridCol w:w="3469"/>
+        <w:gridCol w:w="2040"/>
+        <w:gridCol w:w="2377"/>
+        <w:gridCol w:w="1281"/>
+        <w:gridCol w:w="3590"/>
       </w:tblGrid>
       <w:tr>
         <w:trPr>
@@ -861,7 +831,6 @@
           <w:p>
             <w:r>
               <w:rPr>
-                <w:rFonts w:ascii="맑은 고딕" w:hAnsi="맑은 고딕" w:eastAsia="맑은 고딕"/>
                 <w:b/>
                 <w:sz w:val="18"/>
               </w:rPr>
@@ -956,9 +925,7 @@
       </w:pPr>
       <w:r>
         <w:rPr>
-          <w:rFonts w:ascii="맑은 고딕" w:hAnsi="맑은 고딕" w:eastAsia="맑은 고딕"/>
-          <w:b w:val="0"/>
-          <w:sz w:val="20"/>
+          <w:lang w:eastAsia="ko-KR"/>
         </w:rPr>
         <w:t>글로벌 인사이트 산업 전체는 $153B(약 214.2조원) 규모다 (ESOMAR, 2025). 설문·인터뷰·분석·컨설팅을 다 합친 수치이고, 이 중 리서치 소프트웨어 영역($62B)이 서비스($56B)보다 더 빠른 11.5% 성장률을 보인다.</w:t>
       </w:r>
@@ -966,22 +933,37 @@
     <w:p>
       <w:pPr>
         <w:pStyle w:val="31"/>
+        <w:rPr>
+          <w:rFonts w:ascii="맑은 고딕" w:eastAsia="맑은 고딕" w:hAnsi="맑은 고딕"/>
+        </w:rPr>
       </w:pPr>
       <w:bookmarkStart w:id="4" w:name="Xb5108ec14dc08de32f28f716726ac243cc9686e"/>
       <w:bookmarkEnd w:id="3"/>
       <w:r>
+        <w:rPr>
+          <w:rFonts w:ascii="맑은 고딕" w:eastAsia="맑은 고딕" w:hAnsi="맑은 고딕"/>
+        </w:rPr>
         <w:t xml:space="preserve">1-3. SAM </w:t>
       </w:r>
       <w:proofErr w:type="spellStart"/>
       <w:r>
+        <w:rPr>
+          <w:rFonts w:ascii="맑은 고딕" w:eastAsia="맑은 고딕" w:hAnsi="맑은 고딕"/>
+        </w:rPr>
         <w:t>침투율</w:t>
       </w:r>
       <w:proofErr w:type="spellEnd"/>
       <w:r>
+        <w:rPr>
+          <w:rFonts w:ascii="맑은 고딕" w:eastAsia="맑은 고딕" w:hAnsi="맑은 고딕"/>
+        </w:rPr>
         <w:t xml:space="preserve"> </w:t>
       </w:r>
       <w:proofErr w:type="spellStart"/>
       <w:r>
+        <w:rPr>
+          <w:rFonts w:ascii="맑은 고딕" w:eastAsia="맑은 고딕" w:hAnsi="맑은 고딕"/>
+        </w:rPr>
         <w:t>근거</w:t>
       </w:r>
       <w:proofErr w:type="spellEnd"/>
@@ -1384,12 +1366,15 @@
     <w:p>
       <w:pPr>
         <w:pStyle w:val="31"/>
+        <w:rPr>
+          <w:rFonts w:ascii="맑은 고딕" w:eastAsia="맑은 고딕" w:hAnsi="맑은 고딕"/>
+        </w:rPr>
       </w:pPr>
       <w:bookmarkStart w:id="5" w:name="X3df9931278d9404e6f096b5ccf7aec58c2c2945"/>
       <w:bookmarkEnd w:id="4"/>
       <w:r>
         <w:rPr>
-          <w:rFonts w:ascii="맑은 고딕" w:hAnsi="맑은 고딕" w:eastAsia="맑은 고딕"/>
+          <w:rFonts w:ascii="맑은 고딕" w:eastAsia="맑은 고딕" w:hAnsi="맑은 고딕"/>
           <w:b w:val="0"/>
           <w:sz w:val="20"/>
         </w:rPr>
@@ -1408,9 +1393,7 @@
       </w:pPr>
       <w:r>
         <w:rPr>
-          <w:rFonts w:ascii="맑은 고딕" w:hAnsi="맑은 고딕" w:eastAsia="맑은 고딕"/>
-          <w:b w:val="0"/>
-          <w:sz w:val="20"/>
+          <w:lang w:eastAsia="ko-KR"/>
         </w:rPr>
         <w:t>SOM: 보수적 SAM $0.9B~$1.7B의 약 5%인 $45M~$82M(약 630~1,148억원)을 3~5년 내 획득 가능 시장으로 설정했다.</w:t>
       </w:r>
@@ -1421,18 +1404,13 @@
           <w:ilvl w:val="1"/>
           <w:numId w:val="15"/>
         </w:numPr>
+        <w:rPr>
+          <w:lang w:eastAsia="ko-KR"/>
+        </w:rPr>
       </w:pPr>
-      <w:proofErr w:type="spellStart"/>
-      <w:proofErr w:type="gramStart"/>
-      <w:proofErr w:type="spellEnd"/>
-      <w:proofErr w:type="gramEnd"/>
-      <w:proofErr w:type="gramStart"/>
-      <w:proofErr w:type="gramEnd"/>
       <w:r>
         <w:rPr>
-          <w:rFonts w:ascii="맑은 고딕" w:hAnsi="맑은 고딕" w:eastAsia="맑은 고딕"/>
-          <w:b w:val="0"/>
-          <w:sz w:val="20"/>
+          <w:lang w:eastAsia="ko-KR"/>
         </w:rPr>
         <w:t>이 수치는 주요 4~5개사에 $163M+ 투자가 이뤄진 형성 초기 카테고리에서, 지배적 플레이어가 아직 없다는 점을 반영한 가정이다.</w:t>
       </w:r>
@@ -1443,42 +1421,61 @@
           <w:ilvl w:val="1"/>
           <w:numId w:val="15"/>
         </w:numPr>
+        <w:rPr>
+          <w:lang w:eastAsia="ko-KR"/>
+        </w:rPr>
       </w:pPr>
+      <w:r>
+        <w:rPr>
+          <w:lang w:eastAsia="ko-KR"/>
+        </w:rPr>
+        <w:t xml:space="preserve">1차 진입시장: 솔로 </w:t>
+      </w:r>
       <w:proofErr w:type="spellStart"/>
-      <w:proofErr w:type="gramStart"/>
+      <w:r>
+        <w:rPr>
+          <w:lang w:eastAsia="ko-KR"/>
+        </w:rPr>
+        <w:t>빌더와</w:t>
+      </w:r>
       <w:proofErr w:type="spellEnd"/>
-      <w:proofErr w:type="gramEnd"/>
-      <w:proofErr w:type="gramStart"/>
-      <w:proofErr w:type="gramEnd"/>
       <w:r>
         <w:rPr>
-          <w:rFonts w:ascii="맑은 고딕" w:hAnsi="맑은 고딕" w:eastAsia="맑은 고딕"/>
-          <w:b w:val="0"/>
-          <w:sz w:val="20"/>
-        </w:rPr>
-        <w:t>1차 진입시장: 솔로 빌더와 리서치 전담 인력이 없는 PM 팀 기준 $0.93M~$3.33M(약 13~47억원) 규모의 실행시장을 먼저 공략한다.</w:t>
+          <w:lang w:eastAsia="ko-KR"/>
+        </w:rPr>
+        <w:t xml:space="preserve"> 리서치 전담 인력이 없는 PM 팀 기준 $0.93M~$3.33M(약 13~47억원) 규모의 실행시장을 먼저 공략한다.</w:t>
       </w:r>
     </w:p>
     <w:p>
       <w:pPr>
         <w:pStyle w:val="31"/>
+        <w:rPr>
+          <w:rFonts w:ascii="맑은 고딕" w:eastAsia="맑은 고딕" w:hAnsi="맑은 고딕"/>
+          <w:lang w:eastAsia="ko-KR"/>
+        </w:rPr>
       </w:pPr>
       <w:bookmarkStart w:id="6" w:name="X576ad54750279bc71782e3cec6d419e7f686dbd"/>
       <w:bookmarkEnd w:id="5"/>
-      <w:proofErr w:type="spellStart"/>
-      <w:proofErr w:type="spellEnd"/>
-      <w:proofErr w:type="spellStart"/>
-      <w:proofErr w:type="spellEnd"/>
-      <w:proofErr w:type="spellStart"/>
-      <w:proofErr w:type="spellEnd"/>
       <w:r>
         <w:rPr>
-          <w:rFonts w:ascii="맑은 고딕" w:hAnsi="맑은 고딕" w:eastAsia="맑은 고딕"/>
+          <w:rFonts w:ascii="맑은 고딕" w:eastAsia="맑은 고딕" w:hAnsi="맑은 고딕"/>
           <w:b w:val="0"/>
           <w:sz w:val="20"/>
-        </w:rPr>
-        <w:t>1-5. 확장 전환 시장과 전략적 총기회</w:t>
+          <w:lang w:eastAsia="ko-KR"/>
+        </w:rPr>
+        <w:t xml:space="preserve">1-5. 확장 전환 시장과 전략적 </w:t>
       </w:r>
+      <w:proofErr w:type="spellStart"/>
+      <w:r>
+        <w:rPr>
+          <w:rFonts w:ascii="맑은 고딕" w:eastAsia="맑은 고딕" w:hAnsi="맑은 고딕"/>
+          <w:b w:val="0"/>
+          <w:sz w:val="20"/>
+          <w:lang w:eastAsia="ko-KR"/>
+        </w:rPr>
+        <w:t>총기회</w:t>
+      </w:r>
+      <w:proofErr w:type="spellEnd"/>
     </w:p>
     <w:p>
       <w:pPr>
@@ -1492,9 +1489,7 @@
       </w:pPr>
       <w:r>
         <w:rPr>
-          <w:rFonts w:ascii="맑은 고딕" w:hAnsi="맑은 고딕" w:eastAsia="맑은 고딕"/>
-          <w:b w:val="0"/>
-          <w:sz w:val="20"/>
+          <w:lang w:eastAsia="ko-KR"/>
         </w:rPr>
         <w:t>ESOMAR 기준 시장조사 서비스($56B) 중 디지털 정량조사 비중이 34%($19B)인데, 이 중 40%만 소프트웨어로 전환 가능하다고 잡으면 $7.62B(약 10.67조원)의 추가 기회가 생긴다.</w:t>
       </w:r>
@@ -1509,15 +1504,25 @@
           <w:lang w:eastAsia="ko-KR"/>
         </w:rPr>
       </w:pPr>
+      <w:r>
+        <w:rPr>
+          <w:lang w:eastAsia="ko-KR"/>
+        </w:rPr>
+        <w:t xml:space="preserve">전략적 </w:t>
+      </w:r>
       <w:proofErr w:type="spellStart"/>
+      <w:r>
+        <w:rPr>
+          <w:lang w:eastAsia="ko-KR"/>
+        </w:rPr>
+        <w:t>총기회</w:t>
+      </w:r>
       <w:proofErr w:type="spellEnd"/>
       <w:r>
         <w:rPr>
-          <w:rFonts w:ascii="맑은 고딕" w:hAnsi="맑은 고딕" w:eastAsia="맑은 고딕"/>
-          <w:b w:val="0"/>
-          <w:sz w:val="20"/>
-        </w:rPr>
-        <w:t>전략적 총기회: 보수적 TAM + 확장 전환 = $12.8B~$13.5B(약 17.9~18.9조원)</w:t>
+          <w:lang w:eastAsia="ko-KR"/>
+        </w:rPr>
+        <w:t>: 보수적 TAM + 확장 전환 = $12.8B~$13.5B(약 17.9~18.9조원)</w:t>
       </w:r>
     </w:p>
     <w:p>
@@ -1532,33 +1537,46 @@
       </w:pPr>
       <w:r>
         <w:rPr>
-          <w:rFonts w:ascii="맑은 고딕" w:hAnsi="맑은 고딕" w:eastAsia="맑은 고딕"/>
-          <w:b w:val="0"/>
-          <w:sz w:val="20"/>
-        </w:rPr>
+          <w:lang w:eastAsia="ko-KR"/>
+        </w:rPr>
+        <w:lastRenderedPageBreak/>
         <w:t>이는 TAM 위에 있는 개념이 아니라, 장기적으로 노릴 수 있는 전체 기회를 별도로 보여주는 수치다. 실제 사업화는 1차 진입시장 13~47억원 규모에서 시작한다.</w:t>
       </w:r>
     </w:p>
     <w:p>
       <w:pPr>
         <w:pStyle w:val="31"/>
+        <w:rPr>
+          <w:rFonts w:ascii="맑은 고딕" w:eastAsia="맑은 고딕" w:hAnsi="맑은 고딕"/>
+        </w:rPr>
       </w:pPr>
       <w:bookmarkStart w:id="7" w:name="X872c982e871a53b078ab91a18e6b6a8cb27f30d"/>
       <w:bookmarkEnd w:id="6"/>
       <w:r>
-        <w:lastRenderedPageBreak/>
+        <w:rPr>
+          <w:rFonts w:ascii="맑은 고딕" w:eastAsia="맑은 고딕" w:hAnsi="맑은 고딕"/>
+        </w:rPr>
         <w:t xml:space="preserve">1-6. </w:t>
       </w:r>
       <w:proofErr w:type="spellStart"/>
       <w:r>
+        <w:rPr>
+          <w:rFonts w:ascii="맑은 고딕" w:eastAsia="맑은 고딕" w:hAnsi="맑은 고딕"/>
+        </w:rPr>
         <w:t>한국</w:t>
       </w:r>
       <w:proofErr w:type="spellEnd"/>
       <w:r>
+        <w:rPr>
+          <w:rFonts w:ascii="맑은 고딕" w:eastAsia="맑은 고딕" w:hAnsi="맑은 고딕"/>
+        </w:rPr>
         <w:t xml:space="preserve"> </w:t>
       </w:r>
       <w:proofErr w:type="spellStart"/>
       <w:r>
+        <w:rPr>
+          <w:rFonts w:ascii="맑은 고딕" w:eastAsia="맑은 고딕" w:hAnsi="맑은 고딕"/>
+        </w:rPr>
         <w:t>시장</w:t>
       </w:r>
       <w:proofErr w:type="spellEnd"/>
@@ -1659,6 +1677,7 @@
       <w:pPr>
         <w:pStyle w:val="21"/>
         <w:rPr>
+          <w:rFonts w:ascii="맑은 고딕" w:eastAsia="맑은 고딕" w:hAnsi="맑은 고딕"/>
           <w:lang w:eastAsia="ko-KR"/>
         </w:rPr>
       </w:pPr>
@@ -1667,9 +1686,10 @@
       <w:bookmarkEnd w:id="7"/>
       <w:r>
         <w:rPr>
-          <w:rFonts w:ascii="맑은 고딕" w:hAnsi="맑은 고딕" w:eastAsia="맑은 고딕"/>
+          <w:rFonts w:ascii="맑은 고딕" w:eastAsia="맑은 고딕" w:hAnsi="맑은 고딕"/>
           <w:b w:val="0"/>
           <w:sz w:val="20"/>
+          <w:lang w:eastAsia="ko-KR"/>
         </w:rPr>
         <w:t>2. 수익 구조 및 단위 경제학 상세</w:t>
       </w:r>
@@ -1682,9 +1702,7 @@
       </w:pPr>
       <w:r>
         <w:rPr>
-          <w:rFonts w:ascii="맑은 고딕" w:hAnsi="맑은 고딕" w:eastAsia="맑은 고딕"/>
-          <w:b w:val="0"/>
-          <w:sz w:val="20"/>
+          <w:lang w:eastAsia="ko-KR"/>
         </w:rPr>
         <w:t>본문 「3. 성장전략」 3)항 비즈니스 모델, 4)항 매출 및 손익, 6)항 투자유치 전략의 수치 근거</w:t>
       </w:r>
@@ -1693,55 +1711,22 @@
       <w:pPr>
         <w:pStyle w:val="31"/>
         <w:rPr>
+          <w:rFonts w:ascii="맑은 고딕" w:eastAsia="맑은 고딕" w:hAnsi="맑은 고딕"/>
           <w:lang w:eastAsia="ko-KR"/>
         </w:rPr>
       </w:pPr>
       <w:bookmarkStart w:id="9" w:name="X99c15bb971fb186c2f6761c314a796d68c2bd24"/>
       <w:r>
         <w:rPr>
+          <w:rFonts w:ascii="맑은 고딕" w:eastAsia="맑은 고딕" w:hAnsi="맑은 고딕"/>
           <w:lang w:eastAsia="ko-KR"/>
         </w:rPr>
-        <w:t xml:space="preserve">2-1. LLM </w:t>
-      </w:r>
-      <w:r>
-        <w:rPr>
-          <w:lang w:eastAsia="ko-KR"/>
-        </w:rPr>
-        <w:t>모델</w:t>
-      </w:r>
-      <w:r>
-        <w:rPr>
-          <w:lang w:eastAsia="ko-KR"/>
-        </w:rPr>
-        <w:t xml:space="preserve"> </w:t>
-      </w:r>
-      <w:r>
-        <w:rPr>
-          <w:lang w:eastAsia="ko-KR"/>
-        </w:rPr>
-        <w:t>전략</w:t>
-      </w:r>
-      <w:r>
-        <w:rPr>
-          <w:lang w:eastAsia="ko-KR"/>
-        </w:rPr>
-        <w:t xml:space="preserve"> — </w:t>
-      </w:r>
-      <w:r>
-        <w:rPr>
-          <w:lang w:eastAsia="ko-KR"/>
-        </w:rPr>
-        <w:t>경량</w:t>
-      </w:r>
-      <w:r>
-        <w:rPr>
-          <w:lang w:eastAsia="ko-KR"/>
-        </w:rPr>
-        <w:t xml:space="preserve"> 60</w:t>
+        <w:t>2-1. LLM 모델 전략 — 경량 60</w:t>
       </w:r>
       <w:proofErr w:type="gramStart"/>
       <w:r>
         <w:rPr>
+          <w:rFonts w:ascii="맑은 고딕" w:eastAsia="맑은 고딕" w:hAnsi="맑은 고딕"/>
           <w:lang w:eastAsia="ko-KR"/>
         </w:rPr>
         <w:t>% :</w:t>
@@ -1749,33 +1734,10 @@
       <w:proofErr w:type="gramEnd"/>
       <w:r>
         <w:rPr>
+          <w:rFonts w:ascii="맑은 고딕" w:eastAsia="맑은 고딕" w:hAnsi="맑은 고딕"/>
           <w:lang w:eastAsia="ko-KR"/>
         </w:rPr>
-        <w:t xml:space="preserve"> </w:t>
-      </w:r>
-      <w:r>
-        <w:rPr>
-          <w:lang w:eastAsia="ko-KR"/>
-        </w:rPr>
-        <w:t>고성능</w:t>
-      </w:r>
-      <w:r>
-        <w:rPr>
-          <w:lang w:eastAsia="ko-KR"/>
-        </w:rPr>
-        <w:t xml:space="preserve"> </w:t>
-      </w:r>
-      <w:r>
-        <w:rPr>
-          <w:lang w:eastAsia="ko-KR"/>
-        </w:rPr>
-        <w:t>추론</w:t>
-      </w:r>
-      <w:r>
-        <w:rPr>
-          <w:lang w:eastAsia="ko-KR"/>
-        </w:rPr>
-        <w:t xml:space="preserve"> 40%</w:t>
+        <w:t xml:space="preserve"> 고성능 추론 40%</w:t>
       </w:r>
     </w:p>
     <w:p>
@@ -2499,25 +2461,31 @@
     <w:p>
       <w:pPr>
         <w:pStyle w:val="31"/>
+        <w:rPr>
+          <w:rFonts w:ascii="맑은 고딕" w:eastAsia="맑은 고딕" w:hAnsi="맑은 고딕"/>
+        </w:rPr>
       </w:pPr>
       <w:bookmarkStart w:id="10" w:name="X9edcf529f52d93294af26f6c47baf18c2f91162"/>
       <w:bookmarkEnd w:id="9"/>
       <w:r>
+        <w:rPr>
+          <w:rFonts w:ascii="맑은 고딕" w:eastAsia="맑은 고딕" w:hAnsi="맑은 고딕"/>
+        </w:rPr>
         <w:t xml:space="preserve">2-2. </w:t>
       </w:r>
       <w:proofErr w:type="spellStart"/>
       <w:r>
+        <w:rPr>
+          <w:rFonts w:ascii="맑은 고딕" w:eastAsia="맑은 고딕" w:hAnsi="맑은 고딕"/>
+        </w:rPr>
         <w:t>모드별</w:t>
       </w:r>
       <w:proofErr w:type="spellEnd"/>
       <w:r>
-        <w:t xml:space="preserve"> COGS (1</w:t>
-      </w:r>
-      <w:r>
-        <w:t>인당</w:t>
-      </w:r>
-      <w:r>
-        <w:t>)</w:t>
+        <w:rPr>
+          <w:rFonts w:ascii="맑은 고딕" w:eastAsia="맑은 고딕" w:hAnsi="맑은 고딕"/>
+        </w:rPr>
+        <w:t xml:space="preserve"> COGS (1인당)</w:t>
       </w:r>
     </w:p>
     <w:tbl>
@@ -3118,6 +3086,7 @@
           <w:p>
             <w:proofErr w:type="spellStart"/>
             <w:r>
+              <w:lastRenderedPageBreak/>
               <w:t>제품</w:t>
             </w:r>
             <w:proofErr w:type="spellEnd"/>
@@ -3235,7 +3204,6 @@
         <w:rPr>
           <w:lang w:eastAsia="ko-KR"/>
         </w:rPr>
-        <w:lastRenderedPageBreak/>
         <w:t xml:space="preserve">스텝 기준: 30명 실험에서 Tally.so를 자유 </w:t>
       </w:r>
       <w:proofErr w:type="spellStart"/>
@@ -3274,6 +3242,7 @@
       <w:pPr>
         <w:pStyle w:val="31"/>
         <w:rPr>
+          <w:rFonts w:ascii="맑은 고딕" w:eastAsia="맑은 고딕" w:hAnsi="맑은 고딕"/>
           <w:lang w:eastAsia="ko-KR"/>
         </w:rPr>
       </w:pPr>
@@ -3281,39 +3250,10 @@
       <w:bookmarkEnd w:id="10"/>
       <w:r>
         <w:rPr>
+          <w:rFonts w:ascii="맑은 고딕" w:eastAsia="맑은 고딕" w:hAnsi="맑은 고딕"/>
           <w:lang w:eastAsia="ko-KR"/>
         </w:rPr>
-        <w:t xml:space="preserve">2-3. </w:t>
-      </w:r>
-      <w:r>
-        <w:rPr>
-          <w:lang w:eastAsia="ko-KR"/>
-        </w:rPr>
-        <w:t>건당</w:t>
-      </w:r>
-      <w:r>
-        <w:rPr>
-          <w:lang w:eastAsia="ko-KR"/>
-        </w:rPr>
-        <w:t xml:space="preserve"> </w:t>
-      </w:r>
-      <w:r>
-        <w:rPr>
-          <w:lang w:eastAsia="ko-KR"/>
-        </w:rPr>
-        <w:t>손익</w:t>
-      </w:r>
-      <w:r>
-        <w:rPr>
-          <w:lang w:eastAsia="ko-KR"/>
-        </w:rPr>
-        <w:t xml:space="preserve"> — Growth </w:t>
-      </w:r>
-      <w:r>
-        <w:rPr>
-          <w:lang w:eastAsia="ko-KR"/>
-        </w:rPr>
-        <w:t>기준</w:t>
+        <w:t>2-3. 건당 손익 — Growth 기준</w:t>
       </w:r>
     </w:p>
     <w:p>
@@ -4017,9 +3957,7 @@
       </w:pPr>
       <w:r>
         <w:rPr>
-          <w:rFonts w:ascii="맑은 고딕" w:hAnsi="맑은 고딕" w:eastAsia="맑은 고딕"/>
-          <w:b w:val="0"/>
-          <w:sz w:val="20"/>
+          <w:lang w:eastAsia="ko-KR"/>
         </w:rPr>
         <w:t>위 건당 공헌이익은 직접 원가와 결제비용까지 반영한 값이다. 실제 사업 수익성은 이후 인건비, 마케팅, AM, 관리비를 차감한 영업이익 기준으로 별도 계산했다.</w:t>
       </w:r>
@@ -4028,6 +3966,7 @@
       <w:pPr>
         <w:pStyle w:val="31"/>
         <w:rPr>
+          <w:rFonts w:ascii="맑은 고딕" w:eastAsia="맑은 고딕" w:hAnsi="맑은 고딕"/>
           <w:lang w:eastAsia="ko-KR"/>
         </w:rPr>
       </w:pPr>
@@ -4035,63 +3974,10 @@
       <w:bookmarkEnd w:id="11"/>
       <w:r>
         <w:rPr>
+          <w:rFonts w:ascii="맑은 고딕" w:eastAsia="맑은 고딕" w:hAnsi="맑은 고딕"/>
           <w:lang w:eastAsia="ko-KR"/>
         </w:rPr>
-        <w:t xml:space="preserve">2-4. </w:t>
-      </w:r>
-      <w:r>
-        <w:rPr>
-          <w:lang w:eastAsia="ko-KR"/>
-        </w:rPr>
-        <w:t>가격</w:t>
-      </w:r>
-      <w:r>
-        <w:rPr>
-          <w:lang w:eastAsia="ko-KR"/>
-        </w:rPr>
-        <w:t xml:space="preserve"> </w:t>
-      </w:r>
-      <w:r>
-        <w:rPr>
-          <w:lang w:eastAsia="ko-KR"/>
-        </w:rPr>
-        <w:t>결정</w:t>
-      </w:r>
-      <w:r>
-        <w:rPr>
-          <w:lang w:eastAsia="ko-KR"/>
-        </w:rPr>
-        <w:t xml:space="preserve"> </w:t>
-      </w:r>
-      <w:r>
-        <w:rPr>
-          <w:lang w:eastAsia="ko-KR"/>
-        </w:rPr>
-        <w:t>근거</w:t>
-      </w:r>
-      <w:r>
-        <w:rPr>
-          <w:lang w:eastAsia="ko-KR"/>
-        </w:rPr>
-        <w:t xml:space="preserve"> — </w:t>
-      </w:r>
-      <w:r>
-        <w:rPr>
-          <w:lang w:eastAsia="ko-KR"/>
-        </w:rPr>
-        <w:t>경쟁사</w:t>
-      </w:r>
-      <w:r>
-        <w:rPr>
-          <w:lang w:eastAsia="ko-KR"/>
-        </w:rPr>
-        <w:t xml:space="preserve"> </w:t>
-      </w:r>
-      <w:r>
-        <w:rPr>
-          <w:lang w:eastAsia="ko-KR"/>
-        </w:rPr>
-        <w:t>비교</w:t>
+        <w:t>2-4. 가격 결정 근거 — 경쟁사 비교</w:t>
       </w:r>
     </w:p>
     <w:tbl>
@@ -4361,6 +4247,7 @@
           </w:tcPr>
           <w:p>
             <w:r>
+              <w:lastRenderedPageBreak/>
               <w:t>User Interviews</w:t>
             </w:r>
           </w:p>
@@ -4497,7 +4384,6 @@
           </w:tcPr>
           <w:p>
             <w:r>
-              <w:lastRenderedPageBreak/>
               <w:t xml:space="preserve">Simile, Ditto, </w:t>
             </w:r>
             <w:proofErr w:type="spellStart"/>
@@ -5142,6 +5028,7 @@
       <w:pPr>
         <w:pStyle w:val="31"/>
         <w:rPr>
+          <w:rFonts w:ascii="맑은 고딕" w:eastAsia="맑은 고딕" w:hAnsi="맑은 고딕"/>
           <w:lang w:eastAsia="ko-KR"/>
         </w:rPr>
       </w:pPr>
@@ -5149,51 +5036,10 @@
       <w:bookmarkEnd w:id="12"/>
       <w:r>
         <w:rPr>
+          <w:rFonts w:ascii="맑은 고딕" w:eastAsia="맑은 고딕" w:hAnsi="맑은 고딕"/>
           <w:lang w:eastAsia="ko-KR"/>
         </w:rPr>
-        <w:t xml:space="preserve">2-5. </w:t>
-      </w:r>
-      <w:r>
-        <w:rPr>
-          <w:lang w:eastAsia="ko-KR"/>
-        </w:rPr>
-        <w:t>페르소나</w:t>
-      </w:r>
-      <w:r>
-        <w:rPr>
-          <w:lang w:eastAsia="ko-KR"/>
-        </w:rPr>
-        <w:t xml:space="preserve"> </w:t>
-      </w:r>
-      <w:r>
-        <w:rPr>
-          <w:lang w:eastAsia="ko-KR"/>
-        </w:rPr>
-        <w:t>규모별</w:t>
-      </w:r>
-      <w:r>
-        <w:rPr>
-          <w:lang w:eastAsia="ko-KR"/>
-        </w:rPr>
-        <w:t xml:space="preserve"> </w:t>
-      </w:r>
-      <w:r>
-        <w:rPr>
-          <w:lang w:eastAsia="ko-KR"/>
-        </w:rPr>
-        <w:t>분석</w:t>
-      </w:r>
-      <w:r>
-        <w:rPr>
-          <w:lang w:eastAsia="ko-KR"/>
-        </w:rPr>
-        <w:t xml:space="preserve"> </w:t>
-      </w:r>
-      <w:r>
-        <w:rPr>
-          <w:lang w:eastAsia="ko-KR"/>
-        </w:rPr>
-        <w:t>범위</w:t>
+        <w:t>2-5. 페르소나 규모별 분석 범위</w:t>
       </w:r>
     </w:p>
     <w:tbl>
@@ -5528,6 +5374,7 @@
       <w:pPr>
         <w:pStyle w:val="21"/>
         <w:rPr>
+          <w:rFonts w:ascii="맑은 고딕" w:eastAsia="맑은 고딕" w:hAnsi="맑은 고딕"/>
           <w:lang w:eastAsia="ko-KR"/>
         </w:rPr>
       </w:pPr>
@@ -5536,40 +5383,11 @@
       <w:bookmarkEnd w:id="13"/>
       <w:r>
         <w:rPr>
+          <w:rFonts w:ascii="맑은 고딕" w:eastAsia="맑은 고딕" w:hAnsi="맑은 고딕"/>
           <w:lang w:eastAsia="ko-KR"/>
         </w:rPr>
         <w:lastRenderedPageBreak/>
-        <w:t xml:space="preserve">3. </w:t>
-      </w:r>
-      <w:r>
-        <w:rPr>
-          <w:lang w:eastAsia="ko-KR"/>
-        </w:rPr>
-        <w:t>검증</w:t>
-      </w:r>
-      <w:r>
-        <w:rPr>
-          <w:lang w:eastAsia="ko-KR"/>
-        </w:rPr>
-        <w:t xml:space="preserve"> </w:t>
-      </w:r>
-      <w:r>
-        <w:rPr>
-          <w:lang w:eastAsia="ko-KR"/>
-        </w:rPr>
-        <w:t>실험</w:t>
-      </w:r>
-      <w:r>
-        <w:rPr>
-          <w:lang w:eastAsia="ko-KR"/>
-        </w:rPr>
-        <w:t xml:space="preserve"> </w:t>
-      </w:r>
-      <w:r>
-        <w:rPr>
-          <w:lang w:eastAsia="ko-KR"/>
-        </w:rPr>
-        <w:t>상세</w:t>
+        <w:t>3. 검증 실험 상세</w:t>
       </w:r>
     </w:p>
     <w:p>
@@ -5589,57 +5407,17 @@
       <w:pPr>
         <w:pStyle w:val="31"/>
         <w:rPr>
+          <w:rFonts w:ascii="맑은 고딕" w:eastAsia="맑은 고딕" w:hAnsi="맑은 고딕"/>
           <w:lang w:eastAsia="ko-KR"/>
         </w:rPr>
       </w:pPr>
       <w:bookmarkStart w:id="15" w:name="X63eb4220ba678c49d2dad953b2837d7e3979e9e"/>
       <w:r>
         <w:rPr>
+          <w:rFonts w:ascii="맑은 고딕" w:eastAsia="맑은 고딕" w:hAnsi="맑은 고딕"/>
           <w:lang w:eastAsia="ko-KR"/>
         </w:rPr>
-        <w:t xml:space="preserve">3-1. </w:t>
-      </w:r>
-      <w:r>
-        <w:rPr>
-          <w:lang w:eastAsia="ko-KR"/>
-        </w:rPr>
-        <w:t>분화</w:t>
-      </w:r>
-      <w:r>
-        <w:rPr>
-          <w:lang w:eastAsia="ko-KR"/>
-        </w:rPr>
-        <w:t xml:space="preserve"> </w:t>
-      </w:r>
-      <w:r>
-        <w:rPr>
-          <w:lang w:eastAsia="ko-KR"/>
-        </w:rPr>
-        <w:t>검증</w:t>
-      </w:r>
-      <w:r>
-        <w:rPr>
-          <w:lang w:eastAsia="ko-KR"/>
-        </w:rPr>
-        <w:t xml:space="preserve"> — Tally.so 30</w:t>
-      </w:r>
-      <w:r>
-        <w:rPr>
-          <w:lang w:eastAsia="ko-KR"/>
-        </w:rPr>
-        <w:t>명</w:t>
-      </w:r>
-      <w:r>
-        <w:rPr>
-          <w:lang w:eastAsia="ko-KR"/>
-        </w:rPr>
-        <w:t xml:space="preserve"> </w:t>
-      </w:r>
-      <w:r>
-        <w:rPr>
-          <w:lang w:eastAsia="ko-KR"/>
-        </w:rPr>
-        <w:t>시뮬레이션</w:t>
+        <w:t>3-1. 분화 검증 — Tally.so 30명 시뮬레이션</w:t>
       </w:r>
     </w:p>
     <w:p>
@@ -6198,6 +5976,7 @@
       <w:pPr>
         <w:pStyle w:val="31"/>
         <w:rPr>
+          <w:rFonts w:ascii="맑은 고딕" w:eastAsia="맑은 고딕" w:hAnsi="맑은 고딕"/>
           <w:lang w:eastAsia="ko-KR"/>
         </w:rPr>
       </w:pPr>
@@ -6205,118 +5984,24 @@
       <w:bookmarkEnd w:id="15"/>
       <w:r>
         <w:rPr>
+          <w:rFonts w:ascii="맑은 고딕" w:eastAsia="맑은 고딕" w:hAnsi="맑은 고딕"/>
           <w:lang w:eastAsia="ko-KR"/>
         </w:rPr>
-        <w:t xml:space="preserve">3-2. </w:t>
+        <w:t>3-2. 현실성 검증 — G2</w:t>
       </w:r>
       <w:r>
         <w:rPr>
+          <w:rFonts w:ascii="맑은 고딕" w:eastAsia="맑은 고딕" w:hAnsi="맑은 고딕" w:hint="eastAsia"/>
           <w:lang w:eastAsia="ko-KR"/>
         </w:rPr>
-        <w:t>현실성</w:t>
+        <w:t>(글로벌 SaaS 리뷰 플랫폼)</w:t>
       </w:r>
       <w:r>
         <w:rPr>
+          <w:rFonts w:ascii="맑은 고딕" w:eastAsia="맑은 고딕" w:hAnsi="맑은 고딕"/>
           <w:lang w:eastAsia="ko-KR"/>
         </w:rPr>
-        <w:t xml:space="preserve"> </w:t>
-      </w:r>
-      <w:r>
-        <w:rPr>
-          <w:lang w:eastAsia="ko-KR"/>
-        </w:rPr>
-        <w:t>검증</w:t>
-      </w:r>
-      <w:r>
-        <w:rPr>
-          <w:lang w:eastAsia="ko-KR"/>
-        </w:rPr>
-        <w:t xml:space="preserve"> — G2</w:t>
-      </w:r>
-      <w:r>
-        <w:rPr>
-          <w:rFonts w:eastAsia="맑은 고딕" w:hint="eastAsia"/>
-          <w:lang w:eastAsia="ko-KR"/>
-        </w:rPr>
-        <w:t>(</w:t>
-      </w:r>
-      <w:r>
-        <w:rPr>
-          <w:rFonts w:eastAsia="맑은 고딕" w:hint="eastAsia"/>
-          <w:lang w:eastAsia="ko-KR"/>
-        </w:rPr>
-        <w:t>글로벌</w:t>
-      </w:r>
-      <w:r>
-        <w:rPr>
-          <w:rFonts w:eastAsia="맑은 고딕" w:hint="eastAsia"/>
-          <w:lang w:eastAsia="ko-KR"/>
-        </w:rPr>
-        <w:t xml:space="preserve"> SaaS </w:t>
-      </w:r>
-      <w:r>
-        <w:rPr>
-          <w:rFonts w:eastAsia="맑은 고딕" w:hint="eastAsia"/>
-          <w:lang w:eastAsia="ko-KR"/>
-        </w:rPr>
-        <w:t>리뷰</w:t>
-      </w:r>
-      <w:r>
-        <w:rPr>
-          <w:rFonts w:eastAsia="맑은 고딕" w:hint="eastAsia"/>
-          <w:lang w:eastAsia="ko-KR"/>
-        </w:rPr>
-        <w:t xml:space="preserve"> </w:t>
-      </w:r>
-      <w:r>
-        <w:rPr>
-          <w:rFonts w:eastAsia="맑은 고딕" w:hint="eastAsia"/>
-          <w:lang w:eastAsia="ko-KR"/>
-        </w:rPr>
-        <w:t>플랫폼</w:t>
-      </w:r>
-      <w:r>
-        <w:rPr>
-          <w:rFonts w:eastAsia="맑은 고딕" w:hint="eastAsia"/>
-          <w:lang w:eastAsia="ko-KR"/>
-        </w:rPr>
-        <w:t>)</w:t>
-      </w:r>
-      <w:r>
-        <w:rPr>
-          <w:lang w:eastAsia="ko-KR"/>
-        </w:rPr>
-        <w:t xml:space="preserve"> </w:t>
-      </w:r>
-      <w:r>
-        <w:rPr>
-          <w:lang w:eastAsia="ko-KR"/>
-        </w:rPr>
-        <w:t>리뷰</w:t>
-      </w:r>
-      <w:r>
-        <w:rPr>
-          <w:lang w:eastAsia="ko-KR"/>
-        </w:rPr>
-        <w:t xml:space="preserve"> 88</w:t>
-      </w:r>
-      <w:r>
-        <w:rPr>
-          <w:lang w:eastAsia="ko-KR"/>
-        </w:rPr>
-        <w:t>개</w:t>
-      </w:r>
-      <w:r>
-        <w:rPr>
-          <w:lang w:eastAsia="ko-KR"/>
-        </w:rPr>
-        <w:t xml:space="preserve"> </w:t>
-      </w:r>
-      <w:r>
-        <w:rPr>
-          <w:lang w:eastAsia="ko-KR"/>
-        </w:rPr>
-        <w:t>비교</w:t>
+        <w:t xml:space="preserve"> 리뷰 88개 비교</w:t>
       </w:r>
     </w:p>
     <w:tbl>
@@ -6657,30 +6342,51 @@
     <w:p>
       <w:pPr>
         <w:pStyle w:val="31"/>
+        <w:rPr>
+          <w:rFonts w:ascii="맑은 고딕" w:eastAsia="맑은 고딕" w:hAnsi="맑은 고딕"/>
+        </w:rPr>
       </w:pPr>
       <w:bookmarkStart w:id="17" w:name="X70c20362a63d5205a00b8f63dc0f34239c1096a"/>
       <w:bookmarkEnd w:id="16"/>
       <w:r>
+        <w:rPr>
+          <w:rFonts w:ascii="맑은 고딕" w:eastAsia="맑은 고딕" w:hAnsi="맑은 고딕"/>
+        </w:rPr>
         <w:t xml:space="preserve">3-3. </w:t>
       </w:r>
       <w:proofErr w:type="spellStart"/>
       <w:r>
+        <w:rPr>
+          <w:rFonts w:ascii="맑은 고딕" w:eastAsia="맑은 고딕" w:hAnsi="맑은 고딕"/>
+        </w:rPr>
         <w:t>감정</w:t>
       </w:r>
       <w:proofErr w:type="spellEnd"/>
       <w:r>
+        <w:rPr>
+          <w:rFonts w:ascii="맑은 고딕" w:eastAsia="맑은 고딕" w:hAnsi="맑은 고딕"/>
+        </w:rPr>
         <w:t xml:space="preserve"> </w:t>
       </w:r>
       <w:proofErr w:type="spellStart"/>
       <w:r>
+        <w:rPr>
+          <w:rFonts w:ascii="맑은 고딕" w:eastAsia="맑은 고딕" w:hAnsi="맑은 고딕"/>
+        </w:rPr>
         <w:t>엔진</w:t>
       </w:r>
       <w:proofErr w:type="spellEnd"/>
       <w:r>
+        <w:rPr>
+          <w:rFonts w:ascii="맑은 고딕" w:eastAsia="맑은 고딕" w:hAnsi="맑은 고딕"/>
+        </w:rPr>
         <w:t xml:space="preserve"> ON/OFF </w:t>
       </w:r>
       <w:proofErr w:type="spellStart"/>
       <w:r>
+        <w:rPr>
+          <w:rFonts w:ascii="맑은 고딕" w:eastAsia="맑은 고딕" w:hAnsi="맑은 고딕"/>
+        </w:rPr>
         <w:t>비교</w:t>
       </w:r>
       <w:proofErr w:type="spellEnd"/>
@@ -7110,6 +6816,7 @@
       <w:pPr>
         <w:pStyle w:val="21"/>
         <w:rPr>
+          <w:rFonts w:ascii="맑은 고딕" w:eastAsia="맑은 고딕" w:hAnsi="맑은 고딕"/>
           <w:lang w:eastAsia="ko-KR"/>
         </w:rPr>
       </w:pPr>
@@ -7118,39 +6825,10 @@
       <w:bookmarkEnd w:id="18"/>
       <w:r>
         <w:rPr>
+          <w:rFonts w:ascii="맑은 고딕" w:eastAsia="맑은 고딕" w:hAnsi="맑은 고딕"/>
           <w:lang w:eastAsia="ko-KR"/>
         </w:rPr>
-        <w:t xml:space="preserve">4. </w:t>
-      </w:r>
-      <w:r>
-        <w:rPr>
-          <w:lang w:eastAsia="ko-KR"/>
-        </w:rPr>
-        <w:t>경쟁사</w:t>
-      </w:r>
-      <w:r>
-        <w:rPr>
-          <w:lang w:eastAsia="ko-KR"/>
-        </w:rPr>
-        <w:t xml:space="preserve"> </w:t>
-      </w:r>
-      <w:r>
-        <w:rPr>
-          <w:lang w:eastAsia="ko-KR"/>
-        </w:rPr>
-        <w:t>상세</w:t>
-      </w:r>
-      <w:r>
-        <w:rPr>
-          <w:lang w:eastAsia="ko-KR"/>
-        </w:rPr>
-        <w:t xml:space="preserve"> </w:t>
-      </w:r>
-      <w:r>
-        <w:rPr>
-          <w:lang w:eastAsia="ko-KR"/>
-        </w:rPr>
-        <w:t>분석</w:t>
+        <w:t>4. 경쟁사 상세 분석</w:t>
       </w:r>
     </w:p>
     <w:p>
@@ -7170,22 +6848,37 @@
     <w:p>
       <w:pPr>
         <w:pStyle w:val="31"/>
+        <w:rPr>
+          <w:rFonts w:ascii="맑은 고딕" w:eastAsia="맑은 고딕" w:hAnsi="맑은 고딕"/>
+        </w:rPr>
       </w:pPr>
       <w:bookmarkStart w:id="21" w:name="X40498174538b4f24d892425718ce4288f8ac486"/>
       <w:bookmarkEnd w:id="20"/>
       <w:r>
+        <w:rPr>
+          <w:rFonts w:ascii="맑은 고딕" w:eastAsia="맑은 고딕" w:hAnsi="맑은 고딕"/>
+        </w:rPr>
         <w:t xml:space="preserve">4-2. </w:t>
       </w:r>
       <w:proofErr w:type="spellStart"/>
       <w:r>
+        <w:rPr>
+          <w:rFonts w:ascii="맑은 고딕" w:eastAsia="맑은 고딕" w:hAnsi="맑은 고딕"/>
+        </w:rPr>
         <w:t>한국</w:t>
       </w:r>
       <w:proofErr w:type="spellEnd"/>
       <w:r>
+        <w:rPr>
+          <w:rFonts w:ascii="맑은 고딕" w:eastAsia="맑은 고딕" w:hAnsi="맑은 고딕"/>
+        </w:rPr>
         <w:t xml:space="preserve"> </w:t>
       </w:r>
       <w:proofErr w:type="spellStart"/>
       <w:r>
+        <w:rPr>
+          <w:rFonts w:ascii="맑은 고딕" w:eastAsia="맑은 고딕" w:hAnsi="맑은 고딕"/>
+        </w:rPr>
         <w:t>시장</w:t>
       </w:r>
       <w:proofErr w:type="spellEnd"/>
@@ -7641,6 +7334,7 @@
       <w:pPr>
         <w:pStyle w:val="21"/>
         <w:rPr>
+          <w:rFonts w:ascii="맑은 고딕" w:eastAsia="맑은 고딕" w:hAnsi="맑은 고딕"/>
           <w:lang w:eastAsia="ko-KR"/>
         </w:rPr>
       </w:pPr>
@@ -7649,75 +7343,10 @@
       <w:bookmarkEnd w:id="21"/>
       <w:r>
         <w:rPr>
+          <w:rFonts w:ascii="맑은 고딕" w:eastAsia="맑은 고딕" w:hAnsi="맑은 고딕"/>
           <w:lang w:eastAsia="ko-KR"/>
         </w:rPr>
-        <w:t xml:space="preserve">5. AI </w:t>
-      </w:r>
-      <w:r>
-        <w:rPr>
-          <w:lang w:eastAsia="ko-KR"/>
-        </w:rPr>
-        <w:t>긍정</w:t>
-      </w:r>
-      <w:r>
-        <w:rPr>
-          <w:lang w:eastAsia="ko-KR"/>
-        </w:rPr>
-        <w:t xml:space="preserve"> </w:t>
-      </w:r>
-      <w:r>
-        <w:rPr>
-          <w:lang w:eastAsia="ko-KR"/>
-        </w:rPr>
-        <w:t>편향</w:t>
-      </w:r>
-      <w:r>
-        <w:rPr>
-          <w:lang w:eastAsia="ko-KR"/>
-        </w:rPr>
-        <w:t>(</w:t>
-      </w:r>
-      <w:r>
-        <w:rPr>
-          <w:lang w:eastAsia="ko-KR"/>
-        </w:rPr>
-        <w:t>아부</w:t>
-      </w:r>
-      <w:r>
-        <w:rPr>
-          <w:lang w:eastAsia="ko-KR"/>
-        </w:rPr>
-        <w:t xml:space="preserve"> </w:t>
-      </w:r>
-      <w:r>
-        <w:rPr>
-          <w:lang w:eastAsia="ko-KR"/>
-        </w:rPr>
-        <w:t>편향</w:t>
-      </w:r>
-      <w:r>
-        <w:rPr>
-          <w:lang w:eastAsia="ko-KR"/>
-        </w:rPr>
-        <w:t xml:space="preserve">) </w:t>
-      </w:r>
-      <w:r>
-        <w:rPr>
-          <w:lang w:eastAsia="ko-KR"/>
-        </w:rPr>
-        <w:t>연구</w:t>
-      </w:r>
-      <w:r>
-        <w:rPr>
-          <w:lang w:eastAsia="ko-KR"/>
-        </w:rPr>
-        <w:t xml:space="preserve"> </w:t>
-      </w:r>
-      <w:r>
-        <w:rPr>
-          <w:lang w:eastAsia="ko-KR"/>
-        </w:rPr>
-        <w:t>근거</w:t>
+        <w:t>5. AI 긍정 편향(아부 편향) 연구 근거</w:t>
       </w:r>
     </w:p>
     <w:p>
@@ -7750,21 +7379,36 @@
     <w:p>
       <w:pPr>
         <w:pStyle w:val="31"/>
+        <w:rPr>
+          <w:rFonts w:ascii="맑은 고딕" w:eastAsia="맑은 고딕" w:hAnsi="맑은 고딕"/>
+        </w:rPr>
       </w:pPr>
       <w:bookmarkStart w:id="23" w:name="X79967758e16d684913f63a1cb9200a6d418a06a"/>
       <w:r>
+        <w:rPr>
+          <w:rFonts w:ascii="맑은 고딕" w:eastAsia="맑은 고딕" w:hAnsi="맑은 고딕"/>
+        </w:rPr>
         <w:t xml:space="preserve">5-1. </w:t>
       </w:r>
       <w:proofErr w:type="spellStart"/>
       <w:r>
+        <w:rPr>
+          <w:rFonts w:ascii="맑은 고딕" w:eastAsia="맑은 고딕" w:hAnsi="맑은 고딕"/>
+        </w:rPr>
         <w:t>연구</w:t>
       </w:r>
       <w:proofErr w:type="spellEnd"/>
       <w:r>
+        <w:rPr>
+          <w:rFonts w:ascii="맑은 고딕" w:eastAsia="맑은 고딕" w:hAnsi="맑은 고딕"/>
+        </w:rPr>
         <w:t xml:space="preserve"> </w:t>
       </w:r>
       <w:proofErr w:type="spellStart"/>
       <w:r>
+        <w:rPr>
+          <w:rFonts w:ascii="맑은 고딕" w:eastAsia="맑은 고딕" w:hAnsi="맑은 고딕"/>
+        </w:rPr>
         <w:t>결과</w:t>
       </w:r>
       <w:proofErr w:type="spellEnd"/>
@@ -7913,13 +7557,7 @@
               <w:rPr>
                 <w:lang w:eastAsia="ko-KR"/>
               </w:rPr>
-              <w:t xml:space="preserve">GPT-4, Claude, Gemini 등 주요 모델 응답의 </w:t>
-            </w:r>
-            <w:r>
-              <w:rPr>
-                <w:lang w:eastAsia="ko-KR"/>
-              </w:rPr>
-              <w:t xml:space="preserve">58%가 </w:t>
+              <w:t xml:space="preserve">GPT-4, Claude, Gemini 등 주요 모델 응답의 58%가 </w:t>
             </w:r>
             <w:proofErr w:type="spellStart"/>
             <w:r>
@@ -8000,13 +7638,7 @@
               <w:rPr>
                 <w:lang w:eastAsia="ko-KR"/>
               </w:rPr>
-              <w:t xml:space="preserve">AI는 같은 상황에서 </w:t>
-            </w:r>
-            <w:r>
-              <w:rPr>
-                <w:lang w:eastAsia="ko-KR"/>
-              </w:rPr>
-              <w:t>사람보다 50% 더 높은 비율로 의견에 동조</w:t>
+              <w:t>AI는 같은 상황에서 사람보다 50% 더 높은 비율로 의견에 동조</w:t>
             </w:r>
           </w:p>
         </w:tc>
@@ -8117,6 +7749,7 @@
       <w:pPr>
         <w:pStyle w:val="21"/>
         <w:rPr>
+          <w:rFonts w:ascii="맑은 고딕" w:eastAsia="맑은 고딕" w:hAnsi="맑은 고딕"/>
           <w:lang w:eastAsia="ko-KR"/>
         </w:rPr>
       </w:pPr>
@@ -8125,64 +7758,11 @@
       <w:bookmarkEnd w:id="24"/>
       <w:r>
         <w:rPr>
+          <w:rFonts w:ascii="맑은 고딕" w:eastAsia="맑은 고딕" w:hAnsi="맑은 고딕"/>
           <w:lang w:eastAsia="ko-KR"/>
         </w:rPr>
         <w:lastRenderedPageBreak/>
-        <w:t xml:space="preserve">6. </w:t>
-      </w:r>
-      <w:r>
-        <w:rPr>
-          <w:lang w:eastAsia="ko-KR"/>
-        </w:rPr>
-        <w:t>학술</w:t>
-      </w:r>
-      <w:r>
-        <w:rPr>
-          <w:lang w:eastAsia="ko-KR"/>
-        </w:rPr>
-        <w:t xml:space="preserve"> </w:t>
-      </w:r>
-      <w:r>
-        <w:rPr>
-          <w:lang w:eastAsia="ko-KR"/>
-        </w:rPr>
-        <w:t>근거</w:t>
-      </w:r>
-      <w:r>
-        <w:rPr>
-          <w:lang w:eastAsia="ko-KR"/>
-        </w:rPr>
-        <w:t xml:space="preserve"> — </w:t>
-      </w:r>
-      <w:r>
-        <w:rPr>
-          <w:lang w:eastAsia="ko-KR"/>
-        </w:rPr>
-        <w:t>감정</w:t>
-      </w:r>
-      <w:r>
-        <w:rPr>
-          <w:lang w:eastAsia="ko-KR"/>
-        </w:rPr>
-        <w:t xml:space="preserve"> </w:t>
-      </w:r>
-      <w:r>
-        <w:rPr>
-          <w:lang w:eastAsia="ko-KR"/>
-        </w:rPr>
-        <w:t>재현</w:t>
-      </w:r>
-      <w:r>
-        <w:rPr>
-          <w:lang w:eastAsia="ko-KR"/>
-        </w:rPr>
-        <w:t xml:space="preserve"> </w:t>
-      </w:r>
-      <w:r>
-        <w:rPr>
-          <w:lang w:eastAsia="ko-KR"/>
-        </w:rPr>
-        <w:t>엔진</w:t>
+        <w:t>6. 학술 근거 — 감정 재현 엔진</w:t>
       </w:r>
     </w:p>
     <w:p>
@@ -8201,21 +7781,36 @@
     <w:p>
       <w:pPr>
         <w:pStyle w:val="31"/>
+        <w:rPr>
+          <w:rFonts w:ascii="맑은 고딕" w:eastAsia="맑은 고딕" w:hAnsi="맑은 고딕"/>
+        </w:rPr>
       </w:pPr>
       <w:bookmarkStart w:id="26" w:name="X6cd7a33f0296cdd81635f9f36c1165e65e9ea63"/>
       <w:r>
+        <w:rPr>
+          <w:rFonts w:ascii="맑은 고딕" w:eastAsia="맑은 고딕" w:hAnsi="맑은 고딕"/>
+        </w:rPr>
         <w:t xml:space="preserve">6-1. </w:t>
       </w:r>
       <w:proofErr w:type="spellStart"/>
       <w:r>
+        <w:rPr>
+          <w:rFonts w:ascii="맑은 고딕" w:eastAsia="맑은 고딕" w:hAnsi="맑은 고딕"/>
+        </w:rPr>
         <w:t>에이전트</w:t>
       </w:r>
       <w:proofErr w:type="spellEnd"/>
       <w:r>
+        <w:rPr>
+          <w:rFonts w:ascii="맑은 고딕" w:eastAsia="맑은 고딕" w:hAnsi="맑은 고딕"/>
+        </w:rPr>
         <w:t xml:space="preserve"> </w:t>
       </w:r>
       <w:proofErr w:type="spellStart"/>
       <w:r>
+        <w:rPr>
+          <w:rFonts w:ascii="맑은 고딕" w:eastAsia="맑은 고딕" w:hAnsi="맑은 고딕"/>
+        </w:rPr>
         <w:t>아키텍처</w:t>
       </w:r>
       <w:proofErr w:type="spellEnd"/>
@@ -8593,6 +8188,7 @@
       <w:pPr>
         <w:pStyle w:val="31"/>
         <w:rPr>
+          <w:rFonts w:ascii="맑은 고딕" w:eastAsia="맑은 고딕" w:hAnsi="맑은 고딕"/>
           <w:lang w:eastAsia="ko-KR"/>
         </w:rPr>
       </w:pPr>
@@ -8600,39 +8196,10 @@
       <w:bookmarkEnd w:id="26"/>
       <w:r>
         <w:rPr>
+          <w:rFonts w:ascii="맑은 고딕" w:eastAsia="맑은 고딕" w:hAnsi="맑은 고딕"/>
           <w:lang w:eastAsia="ko-KR"/>
         </w:rPr>
-        <w:t xml:space="preserve">6-2. </w:t>
-      </w:r>
-      <w:r>
-        <w:rPr>
-          <w:lang w:eastAsia="ko-KR"/>
-        </w:rPr>
-        <w:t>페르소나</w:t>
-      </w:r>
-      <w:r>
-        <w:rPr>
-          <w:lang w:eastAsia="ko-KR"/>
-        </w:rPr>
-        <w:t xml:space="preserve"> </w:t>
-      </w:r>
-      <w:r>
-        <w:rPr>
-          <w:lang w:eastAsia="ko-KR"/>
-        </w:rPr>
-        <w:t>시뮬레이션</w:t>
-      </w:r>
-      <w:r>
-        <w:rPr>
-          <w:lang w:eastAsia="ko-KR"/>
-        </w:rPr>
-        <w:t xml:space="preserve"> </w:t>
-      </w:r>
-      <w:r>
-        <w:rPr>
-          <w:lang w:eastAsia="ko-KR"/>
-        </w:rPr>
-        <w:t>정확도</w:t>
+        <w:t>6-2. 페르소나 시뮬레이션 정확도</w:t>
       </w:r>
     </w:p>
     <w:tbl>
@@ -8950,6 +8517,7 @@
       <w:pPr>
         <w:pStyle w:val="31"/>
         <w:rPr>
+          <w:rFonts w:ascii="맑은 고딕" w:eastAsia="맑은 고딕" w:hAnsi="맑은 고딕"/>
           <w:lang w:eastAsia="ko-KR"/>
         </w:rPr>
       </w:pPr>
@@ -8957,51 +8525,10 @@
       <w:bookmarkEnd w:id="27"/>
       <w:r>
         <w:rPr>
+          <w:rFonts w:ascii="맑은 고딕" w:eastAsia="맑은 고딕" w:hAnsi="맑은 고딕"/>
           <w:lang w:eastAsia="ko-KR"/>
         </w:rPr>
-        <w:t xml:space="preserve">6-3. </w:t>
-      </w:r>
-      <w:r>
-        <w:rPr>
-          <w:lang w:eastAsia="ko-KR"/>
-        </w:rPr>
-        <w:t>감정</w:t>
-      </w:r>
-      <w:r>
-        <w:rPr>
-          <w:lang w:eastAsia="ko-KR"/>
-        </w:rPr>
-        <w:t>·</w:t>
-      </w:r>
-      <w:r>
-        <w:rPr>
-          <w:lang w:eastAsia="ko-KR"/>
-        </w:rPr>
-        <w:t>사회</w:t>
-      </w:r>
-      <w:r>
-        <w:rPr>
-          <w:lang w:eastAsia="ko-KR"/>
-        </w:rPr>
-        <w:t xml:space="preserve"> </w:t>
-      </w:r>
-      <w:r>
-        <w:rPr>
-          <w:lang w:eastAsia="ko-KR"/>
-        </w:rPr>
-        <w:t>시뮬레이션</w:t>
-      </w:r>
-      <w:r>
-        <w:rPr>
-          <w:lang w:eastAsia="ko-KR"/>
-        </w:rPr>
-        <w:t xml:space="preserve"> </w:t>
-      </w:r>
-      <w:r>
-        <w:rPr>
-          <w:lang w:eastAsia="ko-KR"/>
-        </w:rPr>
-        <w:t>프레임워크</w:t>
+        <w:t>6-3. 감정·사회 시뮬레이션 프레임워크</w:t>
       </w:r>
     </w:p>
     <w:tbl>
@@ -9302,23 +8829,38 @@
     <w:p>
       <w:pPr>
         <w:pStyle w:val="31"/>
+        <w:rPr>
+          <w:rFonts w:ascii="맑은 고딕" w:eastAsia="맑은 고딕" w:hAnsi="맑은 고딕"/>
+        </w:rPr>
       </w:pPr>
       <w:bookmarkStart w:id="29" w:name="Xbf8b43064c126aa5f663b4df43595bda60a2fd0"/>
       <w:bookmarkEnd w:id="28"/>
       <w:r>
+        <w:rPr>
+          <w:rFonts w:ascii="맑은 고딕" w:eastAsia="맑은 고딕" w:hAnsi="맑은 고딕"/>
+        </w:rPr>
         <w:lastRenderedPageBreak/>
         <w:t xml:space="preserve">6-4. </w:t>
       </w:r>
       <w:proofErr w:type="spellStart"/>
       <w:r>
+        <w:rPr>
+          <w:rFonts w:ascii="맑은 고딕" w:eastAsia="맑은 고딕" w:hAnsi="맑은 고딕"/>
+        </w:rPr>
         <w:t>행동</w:t>
       </w:r>
       <w:proofErr w:type="spellEnd"/>
       <w:r>
+        <w:rPr>
+          <w:rFonts w:ascii="맑은 고딕" w:eastAsia="맑은 고딕" w:hAnsi="맑은 고딕"/>
+        </w:rPr>
         <w:t xml:space="preserve"> </w:t>
       </w:r>
       <w:proofErr w:type="spellStart"/>
       <w:r>
+        <w:rPr>
+          <w:rFonts w:ascii="맑은 고딕" w:eastAsia="맑은 고딕" w:hAnsi="맑은 고딕"/>
+        </w:rPr>
         <w:t>이론</w:t>
       </w:r>
       <w:proofErr w:type="spellEnd"/>
@@ -10078,22 +9620,37 @@
     <w:p>
       <w:pPr>
         <w:pStyle w:val="31"/>
+        <w:rPr>
+          <w:rFonts w:ascii="맑은 고딕" w:eastAsia="맑은 고딕" w:hAnsi="맑은 고딕"/>
+        </w:rPr>
       </w:pPr>
       <w:bookmarkStart w:id="30" w:name="Xfbe8cb611653a8e5c009f91b687f4eb6763de13"/>
       <w:bookmarkEnd w:id="29"/>
       <w:r>
+        <w:rPr>
+          <w:rFonts w:ascii="맑은 고딕" w:eastAsia="맑은 고딕" w:hAnsi="맑은 고딕"/>
+        </w:rPr>
         <w:t xml:space="preserve">6-5. </w:t>
       </w:r>
       <w:proofErr w:type="spellStart"/>
       <w:r>
+        <w:rPr>
+          <w:rFonts w:ascii="맑은 고딕" w:eastAsia="맑은 고딕" w:hAnsi="맑은 고딕"/>
+        </w:rPr>
         <w:t>기억</w:t>
       </w:r>
       <w:proofErr w:type="spellEnd"/>
       <w:r>
+        <w:rPr>
+          <w:rFonts w:ascii="맑은 고딕" w:eastAsia="맑은 고딕" w:hAnsi="맑은 고딕"/>
+        </w:rPr>
         <w:t xml:space="preserve"> </w:t>
       </w:r>
       <w:proofErr w:type="spellStart"/>
       <w:r>
+        <w:rPr>
+          <w:rFonts w:ascii="맑은 고딕" w:eastAsia="맑은 고딕" w:hAnsi="맑은 고딕"/>
+        </w:rPr>
         <w:t>시스템</w:t>
       </w:r>
       <w:proofErr w:type="spellEnd"/>
@@ -10113,8 +9670,8 @@
         <w:tblLook w:val="0020" w:firstRow="1" w:lastRow="0" w:firstColumn="0" w:lastColumn="0" w:noHBand="0" w:noVBand="0"/>
       </w:tblPr>
       <w:tblGrid>
-        <w:gridCol w:w="2323"/>
-        <w:gridCol w:w="5124"/>
+        <w:gridCol w:w="1990"/>
+        <w:gridCol w:w="6907"/>
       </w:tblGrid>
       <w:tr>
         <w:trPr>
@@ -10140,7 +9697,7 @@
         </w:tc>
         <w:tc>
           <w:tcPr>
-            <w:tcW w:w="0" w:type="auto"/>
+            <w:tcW w:w="6907" w:type="dxa"/>
             <w:tcBorders>
               <w:top w:val="single" w:sz="8" w:space="0" w:color="000000"/>
               <w:left w:val="single" w:sz="8" w:space="0" w:color="000000"/>
@@ -10183,7 +9740,7 @@
         </w:tc>
         <w:tc>
           <w:tcPr>
-            <w:tcW w:w="0" w:type="auto"/>
+            <w:tcW w:w="6907" w:type="dxa"/>
             <w:tcBorders>
               <w:top w:val="single" w:sz="8" w:space="0" w:color="000000"/>
               <w:left w:val="single" w:sz="8" w:space="0" w:color="000000"/>
@@ -10247,7 +9804,7 @@
         </w:tc>
         <w:tc>
           <w:tcPr>
-            <w:tcW w:w="0" w:type="auto"/>
+            <w:tcW w:w="6907" w:type="dxa"/>
             <w:tcBorders>
               <w:top w:val="single" w:sz="8" w:space="0" w:color="000000"/>
               <w:left w:val="single" w:sz="8" w:space="0" w:color="000000"/>
@@ -10263,64 +9820,6 @@
             <w:proofErr w:type="spellEnd"/>
             <w:r>
               <w:t xml:space="preserve"> Knowledge Graph, bi-temporal model</w:t>
-            </w:r>
-          </w:p>
-        </w:tc>
-      </w:tr>
-      <w:tr>
-        <w:tc>
-          <w:tcPr>
-            <w:tcW w:w="0" w:type="auto"/>
-            <w:tcBorders>
-              <w:top w:val="single" w:sz="8" w:space="0" w:color="000000"/>
-              <w:left w:val="single" w:sz="8" w:space="0" w:color="000000"/>
-              <w:bottom w:val="single" w:sz="8" w:space="0" w:color="000000"/>
-              <w:right w:val="single" w:sz="8" w:space="0" w:color="000000"/>
-            </w:tcBorders>
-          </w:tcPr>
-          <w:p>
-            <w:r>
-              <w:t>A-Mem (</w:t>
-            </w:r>
-            <w:proofErr w:type="spellStart"/>
-            <w:r>
-              <w:t>NeurIPS</w:t>
-            </w:r>
-            <w:proofErr w:type="spellEnd"/>
-            <w:r>
-              <w:t xml:space="preserve"> 2025)</w:t>
-            </w:r>
-          </w:p>
-        </w:tc>
-        <w:tc>
-          <w:tcPr>
-            <w:tcW w:w="0" w:type="auto"/>
-            <w:tcBorders>
-              <w:top w:val="single" w:sz="8" w:space="0" w:color="000000"/>
-              <w:left w:val="single" w:sz="8" w:space="0" w:color="000000"/>
-              <w:bottom w:val="single" w:sz="8" w:space="0" w:color="000000"/>
-              <w:right w:val="single" w:sz="8" w:space="0" w:color="000000"/>
-            </w:tcBorders>
-          </w:tcPr>
-          <w:p>
-            <w:pPr>
-              <w:rPr>
-                <w:lang w:eastAsia="ko-KR"/>
-              </w:rPr>
-            </w:pPr>
-            <w:proofErr w:type="spellStart"/>
-            <w:r>
-              <w:rPr>
-                <w:lang w:eastAsia="ko-KR"/>
-              </w:rPr>
-              <w:t>Zettelkasten</w:t>
-            </w:r>
-            <w:proofErr w:type="spellEnd"/>
-            <w:r>
-              <w:rPr>
-                <w:lang w:eastAsia="ko-KR"/>
-              </w:rPr>
-              <w:t xml:space="preserve"> 방식, 양방향 링크, 다중 홉 추론 2배</w:t>
             </w:r>
           </w:p>
         </w:tc>
@@ -10337,6 +9836,10 @@
       <w:pPr>
         <w:pStyle w:val="21"/>
         <w:rPr>
+          <w:rFonts w:ascii="맑은 고딕" w:eastAsia="맑은 고딕" w:hAnsi="맑은 고딕"/>
+          <w:bCs w:val="0"/>
+          <w:sz w:val="36"/>
+          <w:szCs w:val="32"/>
           <w:lang w:eastAsia="ko-KR"/>
         </w:rPr>
       </w:pPr>
@@ -10345,9 +9848,11 @@
       <w:bookmarkEnd w:id="30"/>
       <w:r>
         <w:rPr>
-          <w:rFonts w:ascii="맑은 고딕" w:hAnsi="맑은 고딕" w:eastAsia="맑은 고딕"/>
-          <w:b w:val="0"/>
-          <w:sz w:val="20"/>
+          <w:rFonts w:ascii="맑은 고딕" w:eastAsia="맑은 고딕" w:hAnsi="맑은 고딕"/>
+          <w:bCs w:val="0"/>
+          <w:sz w:val="24"/>
+          <w:szCs w:val="32"/>
+          <w:lang w:eastAsia="ko-KR"/>
         </w:rPr>
         <w:t>7. 매출 및 손익 상세 근거</w:t>
       </w:r>
@@ -10360,9 +9865,7 @@
       </w:pPr>
       <w:r>
         <w:rPr>
-          <w:rFonts w:ascii="맑은 고딕" w:hAnsi="맑은 고딕" w:eastAsia="맑은 고딕"/>
-          <w:b w:val="0"/>
-          <w:sz w:val="20"/>
+          <w:lang w:eastAsia="ko-KR"/>
         </w:rPr>
         <w:t>본문 「3. 성장전략」 3)항 비즈니스 모델, 4)항 매출 및 손익 추정, 6)항 투자유치 전략의 산출 방법론</w:t>
       </w:r>
@@ -10370,15 +9873,19 @@
     <w:p>
       <w:pPr>
         <w:pStyle w:val="31"/>
+        <w:rPr>
+          <w:rFonts w:ascii="맑은 고딕" w:eastAsia="맑은 고딕" w:hAnsi="맑은 고딕"/>
+          <w:bCs w:val="0"/>
+          <w:sz w:val="32"/>
+          <w:szCs w:val="28"/>
+        </w:rPr>
       </w:pPr>
       <w:bookmarkStart w:id="32" w:name="Xffad5bc2530b3888baa7e9088631f39ff718cbe"/>
-      <w:proofErr w:type="spellStart"/>
-      <w:proofErr w:type="spellEnd"/>
       <w:r>
         <w:rPr>
-          <w:rFonts w:ascii="맑은 고딕" w:hAnsi="맑은 고딕" w:eastAsia="맑은 고딕"/>
-          <w:b w:val="0"/>
-          <w:sz w:val="20"/>
+          <w:rFonts w:ascii="맑은 고딕" w:eastAsia="맑은 고딕" w:hAnsi="맑은 고딕"/>
+          <w:bCs w:val="0"/>
+          <w:szCs w:val="28"/>
         </w:rPr>
         <w:t>7-1. 판매 방식별 매출 구조</w:t>
       </w:r>
@@ -10398,11 +9905,11 @@
         <w:tblLook w:val="0020" w:firstRow="1" w:lastRow="0" w:firstColumn="0" w:lastColumn="0" w:noHBand="0" w:noVBand="0"/>
       </w:tblPr>
       <w:tblGrid>
-        <w:gridCol w:w="1530"/>
-        <w:gridCol w:w="1087"/>
-        <w:gridCol w:w="1087"/>
-        <w:gridCol w:w="1004"/>
-        <w:gridCol w:w="3126"/>
+        <w:gridCol w:w="1759"/>
+        <w:gridCol w:w="1108"/>
+        <w:gridCol w:w="1385"/>
+        <w:gridCol w:w="1385"/>
+        <w:gridCol w:w="2727"/>
       </w:tblGrid>
       <w:tr>
         <w:trPr>
@@ -10419,11 +9926,8 @@
             </w:tcBorders>
           </w:tcPr>
           <w:p>
-            <w:proofErr w:type="spellStart"/>
-            <w:proofErr w:type="spellEnd"/>
             <w:r>
               <w:rPr>
-                <w:rFonts w:ascii="맑은 고딕" w:hAnsi="맑은 고딕" w:eastAsia="맑은 고딕"/>
                 <w:b/>
                 <w:sz w:val="18"/>
               </w:rPr>
@@ -10445,13 +9949,8 @@
             <w:pPr>
               <w:jc w:val="center"/>
             </w:pPr>
-            <w:proofErr w:type="spellStart"/>
-            <w:proofErr w:type="spellEnd"/>
-            <w:proofErr w:type="spellStart"/>
-            <w:proofErr w:type="spellEnd"/>
             <w:r>
               <w:rPr>
-                <w:rFonts w:ascii="맑은 고딕" w:hAnsi="맑은 고딕" w:eastAsia="맑은 고딕"/>
                 <w:b/>
                 <w:sz w:val="18"/>
               </w:rPr>
@@ -10473,13 +9972,8 @@
             <w:pPr>
               <w:jc w:val="center"/>
             </w:pPr>
-            <w:proofErr w:type="spellStart"/>
-            <w:proofErr w:type="spellEnd"/>
-            <w:proofErr w:type="spellStart"/>
-            <w:proofErr w:type="spellEnd"/>
             <w:r>
               <w:rPr>
-                <w:rFonts w:ascii="맑은 고딕" w:hAnsi="맑은 고딕" w:eastAsia="맑은 고딕"/>
                 <w:b/>
                 <w:sz w:val="18"/>
               </w:rPr>
@@ -10503,7 +9997,6 @@
             </w:pPr>
             <w:r>
               <w:rPr>
-                <w:rFonts w:ascii="맑은 고딕" w:hAnsi="맑은 고딕" w:eastAsia="맑은 고딕"/>
                 <w:b/>
                 <w:sz w:val="18"/>
               </w:rPr>
@@ -10522,11 +10015,8 @@
             </w:tcBorders>
           </w:tcPr>
           <w:p>
-            <w:proofErr w:type="spellStart"/>
-            <w:proofErr w:type="spellEnd"/>
             <w:r>
               <w:rPr>
-                <w:rFonts w:ascii="맑은 고딕" w:hAnsi="맑은 고딕" w:eastAsia="맑은 고딕"/>
                 <w:b/>
                 <w:sz w:val="18"/>
               </w:rPr>
@@ -10554,8 +10044,6 @@
             </w:pPr>
             <w:r>
               <w:rPr>
-                <w:rFonts w:ascii="맑은 고딕" w:hAnsi="맑은 고딕" w:eastAsia="맑은 고딕"/>
-                <w:b w:val="0"/>
                 <w:sz w:val="18"/>
               </w:rPr>
               <w:t>셀프서브 PAYG</w:t>
@@ -10578,8 +10066,6 @@
             </w:pPr>
             <w:r>
               <w:rPr>
-                <w:rFonts w:ascii="맑은 고딕" w:hAnsi="맑은 고딕" w:eastAsia="맑은 고딕"/>
-                <w:b w:val="0"/>
                 <w:sz w:val="18"/>
               </w:rPr>
               <w:t>$190K</w:t>
@@ -10602,8 +10088,6 @@
             </w:pPr>
             <w:r>
               <w:rPr>
-                <w:rFonts w:ascii="맑은 고딕" w:hAnsi="맑은 고딕" w:eastAsia="맑은 고딕"/>
-                <w:b w:val="0"/>
                 <w:sz w:val="18"/>
               </w:rPr>
               <w:t>$1.35M</w:t>
@@ -10626,8 +10110,6 @@
             </w:pPr>
             <w:r>
               <w:rPr>
-                <w:rFonts w:ascii="맑은 고딕" w:hAnsi="맑은 고딕" w:eastAsia="맑은 고딕"/>
-                <w:b w:val="0"/>
                 <w:sz w:val="18"/>
               </w:rPr>
               <w:t>$3.15M</w:t>
@@ -10650,12 +10132,8 @@
                 <w:lang w:eastAsia="ko-KR"/>
               </w:rPr>
             </w:pPr>
-            <w:proofErr w:type="spellStart"/>
-            <w:proofErr w:type="spellEnd"/>
             <w:r>
               <w:rPr>
-                <w:rFonts w:ascii="맑은 고딕" w:hAnsi="맑은 고딕" w:eastAsia="맑은 고딕"/>
-                <w:b w:val="0"/>
                 <w:sz w:val="18"/>
               </w:rPr>
               <w:t>초기 진입의 핵심</w:t>
@@ -10675,12 +10153,8 @@
             </w:tcBorders>
           </w:tcPr>
           <w:p>
-            <w:proofErr w:type="spellStart"/>
-            <w:proofErr w:type="spellEnd"/>
             <w:r>
               <w:rPr>
-                <w:rFonts w:ascii="맑은 고딕" w:hAnsi="맑은 고딕" w:eastAsia="맑은 고딕"/>
-                <w:b w:val="0"/>
                 <w:sz w:val="18"/>
               </w:rPr>
               <w:t>팀형 계약</w:t>
@@ -10703,8 +10177,6 @@
             </w:pPr>
             <w:r>
               <w:rPr>
-                <w:rFonts w:ascii="맑은 고딕" w:hAnsi="맑은 고딕" w:eastAsia="맑은 고딕"/>
-                <w:b w:val="0"/>
                 <w:sz w:val="18"/>
               </w:rPr>
               <w:t>$100K</w:t>
@@ -10727,8 +10199,6 @@
             </w:pPr>
             <w:r>
               <w:rPr>
-                <w:rFonts w:ascii="맑은 고딕" w:hAnsi="맑은 고딕" w:eastAsia="맑은 고딕"/>
-                <w:b w:val="0"/>
                 <w:sz w:val="18"/>
               </w:rPr>
               <w:t>$1.10M</w:t>
@@ -10751,8 +10221,6 @@
             </w:pPr>
             <w:r>
               <w:rPr>
-                <w:rFonts w:ascii="맑은 고딕" w:hAnsi="맑은 고딕" w:eastAsia="맑은 고딕"/>
-                <w:b w:val="0"/>
                 <w:sz w:val="18"/>
               </w:rPr>
               <w:t>$3.85M</w:t>
@@ -10777,9 +10245,8 @@
             </w:pPr>
             <w:r>
               <w:rPr>
-                <w:rFonts w:ascii="맑은 고딕" w:hAnsi="맑은 고딕" w:eastAsia="맑은 고딕"/>
-                <w:b w:val="0"/>
                 <w:sz w:val="18"/>
+                <w:lang w:eastAsia="ko-KR"/>
               </w:rPr>
               <w:t>반복 사용과 ARPU 상승의 중심</w:t>
             </w:r>
@@ -10798,12 +10265,8 @@
             </w:tcBorders>
           </w:tcPr>
           <w:p>
-            <w:proofErr w:type="spellStart"/>
-            <w:proofErr w:type="spellEnd"/>
             <w:r>
               <w:rPr>
-                <w:rFonts w:ascii="맑은 고딕" w:hAnsi="맑은 고딕" w:eastAsia="맑은 고딕"/>
-                <w:b w:val="0"/>
                 <w:sz w:val="18"/>
               </w:rPr>
               <w:t>기업·에이전시 계약</w:t>
@@ -10826,8 +10289,6 @@
             </w:pPr>
             <w:r>
               <w:rPr>
-                <w:rFonts w:ascii="맑은 고딕" w:hAnsi="맑은 고딕" w:eastAsia="맑은 고딕"/>
-                <w:b w:val="0"/>
                 <w:sz w:val="18"/>
               </w:rPr>
               <w:t>-</w:t>
@@ -10850,8 +10311,6 @@
             </w:pPr>
             <w:r>
               <w:rPr>
-                <w:rFonts w:ascii="맑은 고딕" w:hAnsi="맑은 고딕" w:eastAsia="맑은 고딕"/>
-                <w:b w:val="0"/>
                 <w:sz w:val="18"/>
               </w:rPr>
               <w:t>$0.55M</w:t>
@@ -10874,8 +10333,6 @@
             </w:pPr>
             <w:r>
               <w:rPr>
-                <w:rFonts w:ascii="맑은 고딕" w:hAnsi="맑은 고딕" w:eastAsia="맑은 고딕"/>
-                <w:b w:val="0"/>
                 <w:sz w:val="18"/>
               </w:rPr>
               <w:t>$3.50M</w:t>
@@ -10893,12 +10350,8 @@
             </w:tcBorders>
           </w:tcPr>
           <w:p>
-            <w:proofErr w:type="spellStart"/>
-            <w:proofErr w:type="spellEnd"/>
             <w:r>
               <w:rPr>
-                <w:rFonts w:ascii="맑은 고딕" w:hAnsi="맑은 고딕" w:eastAsia="맑은 고딕"/>
-                <w:b w:val="0"/>
                 <w:sz w:val="18"/>
               </w:rPr>
               <w:t>29년부터 영업이익 견인</w:t>
@@ -10918,12 +10371,8 @@
             </w:tcBorders>
           </w:tcPr>
           <w:p>
-            <w:proofErr w:type="spellStart"/>
-            <w:proofErr w:type="spellEnd"/>
             <w:r>
               <w:rPr>
-                <w:rFonts w:ascii="맑은 고딕" w:hAnsi="맑은 고딕" w:eastAsia="맑은 고딕"/>
-                <w:b w:val="0"/>
                 <w:sz w:val="18"/>
               </w:rPr>
               <w:t>고객 수 / ARPU</w:t>
@@ -10946,8 +10395,6 @@
             </w:pPr>
             <w:r>
               <w:rPr>
-                <w:rFonts w:ascii="맑은 고딕" w:hAnsi="맑은 고딕" w:eastAsia="맑은 고딕"/>
-                <w:b w:val="0"/>
                 <w:sz w:val="18"/>
               </w:rPr>
               <w:t>580 / $500</w:t>
@@ -10970,8 +10417,6 @@
             </w:pPr>
             <w:r>
               <w:rPr>
-                <w:rFonts w:ascii="맑은 고딕" w:hAnsi="맑은 고딕" w:eastAsia="맑은 고딕"/>
-                <w:b w:val="0"/>
                 <w:sz w:val="18"/>
               </w:rPr>
               <w:t>3,000 / $1,000</w:t>
@@ -10994,8 +10439,6 @@
             </w:pPr>
             <w:r>
               <w:rPr>
-                <w:rFonts w:ascii="맑은 고딕" w:hAnsi="맑은 고딕" w:eastAsia="맑은 고딕"/>
-                <w:b w:val="0"/>
                 <w:sz w:val="18"/>
               </w:rPr>
               <w:t>7,000 / $1,500</w:t>
@@ -11020,8 +10463,6 @@
             </w:pPr>
             <w:r>
               <w:rPr>
-                <w:rFonts w:ascii="맑은 고딕" w:hAnsi="맑은 고딕" w:eastAsia="맑은 고딕"/>
-                <w:b w:val="0"/>
                 <w:sz w:val="18"/>
               </w:rPr>
               <w:t>결제 계정 기준</w:t>
@@ -11034,6 +10475,10 @@
       <w:pPr>
         <w:pStyle w:val="31"/>
         <w:rPr>
+          <w:rFonts w:ascii="맑은 고딕" w:eastAsia="맑은 고딕" w:hAnsi="맑은 고딕"/>
+          <w:bCs w:val="0"/>
+          <w:sz w:val="32"/>
+          <w:szCs w:val="28"/>
           <w:lang w:eastAsia="ko-KR"/>
         </w:rPr>
       </w:pPr>
@@ -11041,10 +10486,11 @@
       <w:bookmarkEnd w:id="32"/>
       <w:r>
         <w:rPr>
-          <w:rFonts w:ascii="맑은 고딕" w:hAnsi="맑은 고딕" w:eastAsia="맑은 고딕"/>
-          <w:b w:val="0"/>
-          <w:sz w:val="20"/>
-        </w:rPr>
+          <w:rFonts w:ascii="맑은 고딕" w:eastAsia="맑은 고딕" w:hAnsi="맑은 고딕"/>
+          <w:bCs w:val="0"/>
+          <w:szCs w:val="28"/>
+        </w:rPr>
+        <w:lastRenderedPageBreak/>
         <w:t>7-2. 매출 산식과 연도별 해석</w:t>
       </w:r>
     </w:p>
@@ -11057,22 +10503,22 @@
       </w:pPr>
       <w:r>
         <w:rPr>
-          <w:rFonts w:ascii="맑은 고딕" w:hAnsi="맑은 고딕" w:eastAsia="맑은 고딕"/>
-          <w:b w:val="0"/>
-          <w:sz w:val="20"/>
-        </w:rPr>
-        <w:t>연 매출 = Σ (판매 방식별 결제 계정 수 × 판매 방식별 ARPU)</w:t>
+          <w:lang w:eastAsia="ko-KR"/>
+        </w:rPr>
+        <w:t xml:space="preserve">연 매출 = </w:t>
+      </w:r>
+      <w:r>
+        <w:t>Σ</w:t>
+      </w:r>
+      <w:r>
+        <w:rPr>
+          <w:lang w:eastAsia="ko-KR"/>
+        </w:rPr>
+        <w:t xml:space="preserve"> (판매 방식별 결제 계정 수 × 판매 방식별 ARPU)</w:t>
       </w:r>
     </w:p>
     <w:p>
-      <w:proofErr w:type="gramStart"/>
-      <w:proofErr w:type="gramEnd"/>
       <w:r>
-        <w:rPr>
-          <w:rFonts w:ascii="맑은 고딕" w:hAnsi="맑은 고딕" w:eastAsia="맑은 고딕"/>
-          <w:b w:val="0"/>
-          <w:sz w:val="20"/>
-        </w:rPr>
         <w:t>27년 $290K 산식:</w:t>
       </w:r>
     </w:p>
@@ -11082,30 +10528,23 @@
           <w:ilvl w:val="0"/>
           <w:numId w:val="32"/>
         </w:numPr>
+        <w:rPr>
+          <w:lang w:eastAsia="ko-KR"/>
+        </w:rPr>
       </w:pPr>
+      <w:proofErr w:type="spellStart"/>
       <w:r>
         <w:rPr>
-          <w:rFonts w:ascii="맑은 고딕" w:hAnsi="맑은 고딕" w:eastAsia="맑은 고딕"/>
-          <w:b w:val="0"/>
-          <w:sz w:val="20"/>
-        </w:rPr>
-        <w:t>셀프서브 PAYG 500계정 × $380 = $190K</w:t>
+          <w:lang w:eastAsia="ko-KR"/>
+        </w:rPr>
+        <w:t>셀프서브</w:t>
       </w:r>
-    </w:p>
-    <w:p>
-      <w:pPr>
-        <w:numPr>
-          <w:ilvl w:val="0"/>
-          <w:numId w:val="32"/>
-        </w:numPr>
-      </w:pPr>
+      <w:proofErr w:type="spellEnd"/>
       <w:r>
         <w:rPr>
-          <w:rFonts w:ascii="맑은 고딕" w:hAnsi="맑은 고딕" w:eastAsia="맑은 고딕"/>
-          <w:b w:val="0"/>
-          <w:sz w:val="20"/>
-        </w:rPr>
-        <w:t>팀형 계약 80계정 × $1,250 = $100K</w:t>
+          <w:lang w:eastAsia="ko-KR"/>
+        </w:rPr>
+        <w:t xml:space="preserve"> PAYG 500계정 × $380 = $190K</w:t>
       </w:r>
     </w:p>
     <w:p>
@@ -11116,12 +10555,35 @@
         </w:numPr>
       </w:pPr>
       <w:proofErr w:type="spellStart"/>
+      <w:r>
+        <w:t>팀형</w:t>
+      </w:r>
       <w:proofErr w:type="spellEnd"/>
       <w:r>
-        <w:rPr>
-          <w:rFonts w:ascii="맑은 고딕" w:hAnsi="맑은 고딕" w:eastAsia="맑은 고딕"/>
-          <w:b w:val="0"/>
-          <w:sz w:val="20"/>
+        <w:t xml:space="preserve"> </w:t>
+      </w:r>
+      <w:proofErr w:type="spellStart"/>
+      <w:r>
+        <w:t>계약</w:t>
+      </w:r>
+      <w:proofErr w:type="spellEnd"/>
+      <w:r>
+        <w:t xml:space="preserve"> 80계정 × $1,250 = $100K</w:t>
+      </w:r>
+    </w:p>
+    <w:p>
+      <w:pPr>
+        <w:numPr>
+          <w:ilvl w:val="0"/>
+          <w:numId w:val="32"/>
+        </w:numPr>
+        <w:rPr>
+          <w:lang w:eastAsia="ko-KR"/>
+        </w:rPr>
+      </w:pPr>
+      <w:r>
+        <w:rPr>
+          <w:lang w:eastAsia="ko-KR"/>
         </w:rPr>
         <w:t>기업·에이전시 계약 0계정 × - = $0</w:t>
       </w:r>
@@ -11134,25 +10596,16 @@
         </w:numPr>
       </w:pPr>
       <w:proofErr w:type="spellStart"/>
+      <w:r>
+        <w:t>합계</w:t>
+      </w:r>
       <w:proofErr w:type="spellEnd"/>
       <w:r>
-        <w:rPr>
-          <w:rFonts w:ascii="맑은 고딕" w:hAnsi="맑은 고딕" w:eastAsia="맑은 고딕"/>
-          <w:b w:val="0"/>
-          <w:sz w:val="20"/>
-        </w:rPr>
-        <w:t>합계 = $290K</w:t>
+        <w:t xml:space="preserve"> = $290K</w:t>
       </w:r>
     </w:p>
     <w:p>
-      <w:proofErr w:type="gramStart"/>
-      <w:proofErr w:type="gramEnd"/>
       <w:r>
-        <w:rPr>
-          <w:rFonts w:ascii="맑은 고딕" w:hAnsi="맑은 고딕" w:eastAsia="맑은 고딕"/>
-          <w:b w:val="0"/>
-          <w:sz w:val="20"/>
-        </w:rPr>
         <w:t>29년 $10.5M 산식:</w:t>
       </w:r>
     </w:p>
@@ -11162,30 +10615,23 @@
           <w:ilvl w:val="0"/>
           <w:numId w:val="33"/>
         </w:numPr>
+        <w:rPr>
+          <w:lang w:eastAsia="ko-KR"/>
+        </w:rPr>
       </w:pPr>
+      <w:proofErr w:type="spellStart"/>
       <w:r>
         <w:rPr>
-          <w:rFonts w:ascii="맑은 고딕" w:hAnsi="맑은 고딕" w:eastAsia="맑은 고딕"/>
-          <w:b w:val="0"/>
-          <w:sz w:val="20"/>
-        </w:rPr>
-        <w:t>셀프서브 PAYG 4,900계정 × $643 = $3.15M</w:t>
+          <w:lang w:eastAsia="ko-KR"/>
+        </w:rPr>
+        <w:t>셀프서브</w:t>
       </w:r>
-    </w:p>
-    <w:p>
-      <w:pPr>
-        <w:numPr>
-          <w:ilvl w:val="0"/>
-          <w:numId w:val="33"/>
-        </w:numPr>
-      </w:pPr>
+      <w:proofErr w:type="spellEnd"/>
       <w:r>
         <w:rPr>
-          <w:rFonts w:ascii="맑은 고딕" w:hAnsi="맑은 고딕" w:eastAsia="맑은 고딕"/>
-          <w:b w:val="0"/>
-          <w:sz w:val="20"/>
-        </w:rPr>
-        <w:t>팀형 계약 1,900계정 × $2,026 = $3.85M</w:t>
+          <w:lang w:eastAsia="ko-KR"/>
+        </w:rPr>
+        <w:t xml:space="preserve"> PAYG 4,900계정 × $643 = $3.15M</w:t>
       </w:r>
     </w:p>
     <w:p>
@@ -11196,12 +10642,35 @@
         </w:numPr>
       </w:pPr>
       <w:proofErr w:type="spellStart"/>
+      <w:r>
+        <w:t>팀형</w:t>
+      </w:r>
       <w:proofErr w:type="spellEnd"/>
       <w:r>
-        <w:rPr>
-          <w:rFonts w:ascii="맑은 고딕" w:hAnsi="맑은 고딕" w:eastAsia="맑은 고딕"/>
-          <w:b w:val="0"/>
-          <w:sz w:val="20"/>
+        <w:t xml:space="preserve"> </w:t>
+      </w:r>
+      <w:proofErr w:type="spellStart"/>
+      <w:r>
+        <w:t>계약</w:t>
+      </w:r>
+      <w:proofErr w:type="spellEnd"/>
+      <w:r>
+        <w:t xml:space="preserve"> 1,900계정 × $2,026 = $3.85M</w:t>
+      </w:r>
+    </w:p>
+    <w:p>
+      <w:pPr>
+        <w:numPr>
+          <w:ilvl w:val="0"/>
+          <w:numId w:val="33"/>
+        </w:numPr>
+        <w:rPr>
+          <w:lang w:eastAsia="ko-KR"/>
+        </w:rPr>
+      </w:pPr>
+      <w:r>
+        <w:rPr>
+          <w:lang w:eastAsia="ko-KR"/>
         </w:rPr>
         <w:t>기업·에이전시 계약 200계정 × $17,500 = $3.50M</w:t>
       </w:r>
@@ -11214,14 +10683,12 @@
         </w:numPr>
       </w:pPr>
       <w:proofErr w:type="spellStart"/>
+      <w:r>
+        <w:t>합계</w:t>
+      </w:r>
       <w:proofErr w:type="spellEnd"/>
       <w:r>
-        <w:rPr>
-          <w:rFonts w:ascii="맑은 고딕" w:hAnsi="맑은 고딕" w:eastAsia="맑은 고딕"/>
-          <w:b w:val="0"/>
-          <w:sz w:val="20"/>
-        </w:rPr>
-        <w:t>합계 = $10.50M</w:t>
+        <w:t xml:space="preserve"> = $10.50M</w:t>
       </w:r>
     </w:p>
     <w:p>
@@ -11230,38 +10697,97 @@
           <w:ilvl w:val="0"/>
           <w:numId w:val="33"/>
         </w:numPr>
+        <w:rPr>
+          <w:lang w:eastAsia="ko-KR"/>
+        </w:rPr>
       </w:pPr>
+      <w:r>
+        <w:rPr>
+          <w:lang w:eastAsia="ko-KR"/>
+        </w:rPr>
+        <w:t xml:space="preserve">ARPU 500 → 1,000 → 1,500의 상승은 단순 가격 인상이 아니라 </w:t>
+      </w:r>
       <w:proofErr w:type="spellStart"/>
+      <w:r>
+        <w:rPr>
+          <w:lang w:eastAsia="ko-KR"/>
+        </w:rPr>
+        <w:t>셀프서브에서</w:t>
+      </w:r>
       <w:proofErr w:type="spellEnd"/>
       <w:r>
         <w:rPr>
-          <w:rFonts w:ascii="맑은 고딕" w:hAnsi="맑은 고딕" w:eastAsia="맑은 고딕"/>
-          <w:b w:val="0"/>
-          <w:sz w:val="20"/>
-        </w:rPr>
-        <w:t>ARPU 500 → 1,000 → 1,500의 상승은 단순 가격 인상이 아니라 셀프서브에서 팀형 계약, 기업 계약으로 고객 구성이 바뀌는 효과다.</w:t>
+          <w:lang w:eastAsia="ko-KR"/>
+        </w:rPr>
+        <w:t xml:space="preserve"> 팀형 계약, 기업 계약으로 고객 구성이 바뀌는 효과다.</w:t>
       </w:r>
     </w:p>
     <w:p>
       <w:pPr>
         <w:pStyle w:val="31"/>
+        <w:rPr>
+          <w:rFonts w:ascii="맑은 고딕" w:eastAsia="맑은 고딕" w:hAnsi="맑은 고딕"/>
+          <w:bCs w:val="0"/>
+          <w:sz w:val="32"/>
+          <w:szCs w:val="28"/>
+        </w:rPr>
       </w:pPr>
       <w:bookmarkStart w:id="34" w:name="X482f33f3ec2ad1f88ea3d4b753c9fceadb04d88"/>
       <w:bookmarkEnd w:id="33"/>
+      <w:r>
+        <w:rPr>
+          <w:rFonts w:ascii="맑은 고딕" w:eastAsia="맑은 고딕" w:hAnsi="맑은 고딕"/>
+          <w:bCs w:val="0"/>
+          <w:szCs w:val="28"/>
+        </w:rPr>
+        <w:t xml:space="preserve">7-3. </w:t>
+      </w:r>
       <w:proofErr w:type="spellStart"/>
-      <w:proofErr w:type="spellEnd"/>
-      <w:proofErr w:type="spellStart"/>
-      <w:proofErr w:type="spellEnd"/>
-      <w:proofErr w:type="spellStart"/>
+      <w:r>
+        <w:rPr>
+          <w:rFonts w:ascii="맑은 고딕" w:eastAsia="맑은 고딕" w:hAnsi="맑은 고딕"/>
+          <w:bCs w:val="0"/>
+          <w:szCs w:val="28"/>
+        </w:rPr>
+        <w:t>손익과</w:t>
+      </w:r>
       <w:proofErr w:type="spellEnd"/>
       <w:r>
         <w:rPr>
-          <w:rFonts w:ascii="맑은 고딕" w:hAnsi="맑은 고딕" w:eastAsia="맑은 고딕"/>
-          <w:b w:val="0"/>
-          <w:sz w:val="20"/>
-        </w:rPr>
-        <w:t>7-3. 손익과 투자유치 해석</w:t>
+          <w:rFonts w:ascii="맑은 고딕" w:eastAsia="맑은 고딕" w:hAnsi="맑은 고딕"/>
+          <w:bCs w:val="0"/>
+          <w:szCs w:val="28"/>
+        </w:rPr>
+        <w:t xml:space="preserve"> </w:t>
       </w:r>
+      <w:proofErr w:type="spellStart"/>
+      <w:r>
+        <w:rPr>
+          <w:rFonts w:ascii="맑은 고딕" w:eastAsia="맑은 고딕" w:hAnsi="맑은 고딕"/>
+          <w:bCs w:val="0"/>
+          <w:szCs w:val="28"/>
+        </w:rPr>
+        <w:t>투자유치</w:t>
+      </w:r>
+      <w:proofErr w:type="spellEnd"/>
+      <w:r>
+        <w:rPr>
+          <w:rFonts w:ascii="맑은 고딕" w:eastAsia="맑은 고딕" w:hAnsi="맑은 고딕"/>
+          <w:bCs w:val="0"/>
+          <w:szCs w:val="28"/>
+        </w:rPr>
+        <w:t xml:space="preserve"> </w:t>
+      </w:r>
+      <w:proofErr w:type="spellStart"/>
+      <w:r>
+        <w:rPr>
+          <w:rFonts w:ascii="맑은 고딕" w:eastAsia="맑은 고딕" w:hAnsi="맑은 고딕"/>
+          <w:bCs w:val="0"/>
+          <w:szCs w:val="28"/>
+        </w:rPr>
+        <w:t>해석</w:t>
+      </w:r>
+      <w:proofErr w:type="spellEnd"/>
     </w:p>
     <w:tbl>
       <w:tblPr>
@@ -11278,13 +10804,13 @@
         <w:tblLook w:val="0020" w:firstRow="1" w:lastRow="0" w:firstColumn="0" w:lastColumn="0" w:noHBand="0" w:noVBand="0"/>
       </w:tblPr>
       <w:tblGrid>
-        <w:gridCol w:w="777"/>
-        <w:gridCol w:w="1247"/>
-        <w:gridCol w:w="701"/>
-        <w:gridCol w:w="727"/>
-        <w:gridCol w:w="1016"/>
-        <w:gridCol w:w="811"/>
-        <w:gridCol w:w="2057"/>
+        <w:gridCol w:w="801"/>
+        <w:gridCol w:w="1635"/>
+        <w:gridCol w:w="1453"/>
+        <w:gridCol w:w="1145"/>
+        <w:gridCol w:w="1169"/>
+        <w:gridCol w:w="1478"/>
+        <w:gridCol w:w="1607"/>
       </w:tblGrid>
       <w:tr>
         <w:trPr>
@@ -11301,11 +10827,8 @@
             </w:tcBorders>
           </w:tcPr>
           <w:p>
-            <w:proofErr w:type="spellStart"/>
-            <w:proofErr w:type="spellEnd"/>
             <w:r>
               <w:rPr>
-                <w:rFonts w:ascii="맑은 고딕" w:hAnsi="맑은 고딕" w:eastAsia="맑은 고딕"/>
                 <w:b/>
                 <w:sz w:val="18"/>
               </w:rPr>
@@ -11329,7 +10852,6 @@
             </w:pPr>
             <w:r>
               <w:rPr>
-                <w:rFonts w:ascii="맑은 고딕" w:hAnsi="맑은 고딕" w:eastAsia="맑은 고딕"/>
                 <w:b/>
                 <w:sz w:val="18"/>
               </w:rPr>
@@ -11353,7 +10875,6 @@
             </w:pPr>
             <w:r>
               <w:rPr>
-                <w:rFonts w:ascii="맑은 고딕" w:hAnsi="맑은 고딕" w:eastAsia="맑은 고딕"/>
                 <w:b/>
                 <w:sz w:val="18"/>
               </w:rPr>
@@ -11375,11 +10896,8 @@
             <w:pPr>
               <w:jc w:val="center"/>
             </w:pPr>
-            <w:proofErr w:type="spellStart"/>
-            <w:proofErr w:type="spellEnd"/>
             <w:r>
               <w:rPr>
-                <w:rFonts w:ascii="맑은 고딕" w:hAnsi="맑은 고딕" w:eastAsia="맑은 고딕"/>
                 <w:b/>
                 <w:sz w:val="18"/>
               </w:rPr>
@@ -11401,11 +10919,8 @@
             <w:pPr>
               <w:jc w:val="center"/>
             </w:pPr>
-            <w:proofErr w:type="spellStart"/>
-            <w:proofErr w:type="spellEnd"/>
             <w:r>
               <w:rPr>
-                <w:rFonts w:ascii="맑은 고딕" w:hAnsi="맑은 고딕" w:eastAsia="맑은 고딕"/>
                 <w:b/>
                 <w:sz w:val="18"/>
               </w:rPr>
@@ -11427,11 +10942,8 @@
             <w:pPr>
               <w:jc w:val="center"/>
             </w:pPr>
-            <w:proofErr w:type="spellStart"/>
-            <w:proofErr w:type="spellEnd"/>
             <w:r>
               <w:rPr>
-                <w:rFonts w:ascii="맑은 고딕" w:hAnsi="맑은 고딕" w:eastAsia="맑은 고딕"/>
                 <w:b/>
                 <w:sz w:val="18"/>
               </w:rPr>
@@ -11453,11 +10965,8 @@
             <w:pPr>
               <w:jc w:val="center"/>
             </w:pPr>
-            <w:proofErr w:type="spellStart"/>
-            <w:proofErr w:type="spellEnd"/>
             <w:r>
               <w:rPr>
-                <w:rFonts w:ascii="맑은 고딕" w:hAnsi="맑은 고딕" w:eastAsia="맑은 고딕"/>
                 <w:b/>
                 <w:sz w:val="18"/>
               </w:rPr>
@@ -11480,8 +10989,6 @@
           <w:p>
             <w:r>
               <w:rPr>
-                <w:rFonts w:ascii="맑은 고딕" w:hAnsi="맑은 고딕" w:eastAsia="맑은 고딕"/>
-                <w:b w:val="0"/>
                 <w:sz w:val="18"/>
               </w:rPr>
               <w:t>27년</w:t>
@@ -11504,8 +11011,6 @@
             </w:pPr>
             <w:r>
               <w:rPr>
-                <w:rFonts w:ascii="맑은 고딕" w:hAnsi="맑은 고딕" w:eastAsia="맑은 고딕"/>
-                <w:b w:val="0"/>
                 <w:sz w:val="18"/>
               </w:rPr>
               <w:t>$290K</w:t>
@@ -11528,8 +11033,6 @@
             </w:pPr>
             <w:r>
               <w:rPr>
-                <w:rFonts w:ascii="맑은 고딕" w:hAnsi="맑은 고딕" w:eastAsia="맑은 고딕"/>
-                <w:b w:val="0"/>
                 <w:sz w:val="18"/>
               </w:rPr>
               <w:t>$69K</w:t>
@@ -11552,8 +11055,6 @@
             </w:pPr>
             <w:r>
               <w:rPr>
-                <w:rFonts w:ascii="맑은 고딕" w:hAnsi="맑은 고딕" w:eastAsia="맑은 고딕"/>
-                <w:b w:val="0"/>
                 <w:sz w:val="18"/>
               </w:rPr>
               <w:t>$221K</w:t>
@@ -11576,8 +11077,6 @@
             </w:pPr>
             <w:r>
               <w:rPr>
-                <w:rFonts w:ascii="맑은 고딕" w:hAnsi="맑은 고딕" w:eastAsia="맑은 고딕"/>
-                <w:b w:val="0"/>
                 <w:sz w:val="18"/>
               </w:rPr>
               <w:t>$620K</w:t>
@@ -11600,8 +11099,6 @@
             </w:pPr>
             <w:r>
               <w:rPr>
-                <w:rFonts w:ascii="맑은 고딕" w:hAnsi="맑은 고딕" w:eastAsia="맑은 고딕"/>
-                <w:b w:val="0"/>
                 <w:sz w:val="18"/>
               </w:rPr>
               <w:t>-$399K</w:t>
@@ -11621,14 +11118,14 @@
           <w:p>
             <w:pPr>
               <w:jc w:val="center"/>
+              <w:rPr>
+                <w:lang w:eastAsia="ko-KR"/>
+              </w:rPr>
             </w:pPr>
-            <w:proofErr w:type="gramStart"/>
-            <w:proofErr w:type="gramEnd"/>
             <w:r>
               <w:rPr>
-                <w:rFonts w:ascii="맑은 고딕" w:hAnsi="맑은 고딕" w:eastAsia="맑은 고딕"/>
-                <w:b w:val="0"/>
                 <w:sz w:val="18"/>
+                <w:lang w:eastAsia="ko-KR"/>
               </w:rPr>
               <w:t>글로벌 오픈과 GTM 보강 구간</w:t>
             </w:r>
@@ -11649,8 +11146,6 @@
           <w:p>
             <w:r>
               <w:rPr>
-                <w:rFonts w:ascii="맑은 고딕" w:hAnsi="맑은 고딕" w:eastAsia="맑은 고딕"/>
-                <w:b w:val="0"/>
                 <w:sz w:val="18"/>
               </w:rPr>
               <w:t>28년</w:t>
@@ -11673,8 +11168,6 @@
             </w:pPr>
             <w:r>
               <w:rPr>
-                <w:rFonts w:ascii="맑은 고딕" w:hAnsi="맑은 고딕" w:eastAsia="맑은 고딕"/>
-                <w:b w:val="0"/>
                 <w:sz w:val="18"/>
               </w:rPr>
               <w:t>$3.0M</w:t>
@@ -11697,8 +11190,6 @@
             </w:pPr>
             <w:r>
               <w:rPr>
-                <w:rFonts w:ascii="맑은 고딕" w:hAnsi="맑은 고딕" w:eastAsia="맑은 고딕"/>
-                <w:b w:val="0"/>
                 <w:sz w:val="18"/>
               </w:rPr>
               <w:t>$648K</w:t>
@@ -11721,8 +11212,6 @@
             </w:pPr>
             <w:r>
               <w:rPr>
-                <w:rFonts w:ascii="맑은 고딕" w:hAnsi="맑은 고딕" w:eastAsia="맑은 고딕"/>
-                <w:b w:val="0"/>
                 <w:sz w:val="18"/>
               </w:rPr>
               <w:t>$2.35M</w:t>
@@ -11745,8 +11234,6 @@
             </w:pPr>
             <w:r>
               <w:rPr>
-                <w:rFonts w:ascii="맑은 고딕" w:hAnsi="맑은 고딕" w:eastAsia="맑은 고딕"/>
-                <w:b w:val="0"/>
                 <w:sz w:val="18"/>
               </w:rPr>
               <w:t>$1.95M</w:t>
@@ -11769,8 +11256,6 @@
             </w:pPr>
             <w:r>
               <w:rPr>
-                <w:rFonts w:ascii="맑은 고딕" w:hAnsi="맑은 고딕" w:eastAsia="맑은 고딕"/>
-                <w:b w:val="0"/>
                 <w:sz w:val="18"/>
               </w:rPr>
               <w:t>$403K</w:t>
@@ -11791,12 +11276,8 @@
             <w:pPr>
               <w:jc w:val="center"/>
             </w:pPr>
-            <w:proofErr w:type="gramStart"/>
-            <w:proofErr w:type="gramEnd"/>
             <w:r>
               <w:rPr>
-                <w:rFonts w:ascii="맑은 고딕" w:hAnsi="맑은 고딕" w:eastAsia="맑은 고딕"/>
-                <w:b w:val="0"/>
                 <w:sz w:val="18"/>
               </w:rPr>
               <w:t>하반기 흑자 전환</w:t>
@@ -11818,8 +11299,6 @@
           <w:p>
             <w:r>
               <w:rPr>
-                <w:rFonts w:ascii="맑은 고딕" w:hAnsi="맑은 고딕" w:eastAsia="맑은 고딕"/>
-                <w:b w:val="0"/>
                 <w:sz w:val="18"/>
               </w:rPr>
               <w:t>29년</w:t>
@@ -11842,8 +11321,6 @@
             </w:pPr>
             <w:r>
               <w:rPr>
-                <w:rFonts w:ascii="맑은 고딕" w:hAnsi="맑은 고딕" w:eastAsia="맑은 고딕"/>
-                <w:b w:val="0"/>
                 <w:sz w:val="18"/>
               </w:rPr>
               <w:t>$10.5M</w:t>
@@ -11866,8 +11343,6 @@
             </w:pPr>
             <w:r>
               <w:rPr>
-                <w:rFonts w:ascii="맑은 고딕" w:hAnsi="맑은 고딕" w:eastAsia="맑은 고딕"/>
-                <w:b w:val="0"/>
                 <w:sz w:val="18"/>
               </w:rPr>
               <w:t>$2.08M</w:t>
@@ -11890,8 +11365,6 @@
             </w:pPr>
             <w:r>
               <w:rPr>
-                <w:rFonts w:ascii="맑은 고딕" w:hAnsi="맑은 고딕" w:eastAsia="맑은 고딕"/>
-                <w:b w:val="0"/>
                 <w:sz w:val="18"/>
               </w:rPr>
               <w:t>$8.42M</w:t>
@@ -11914,8 +11387,6 @@
             </w:pPr>
             <w:r>
               <w:rPr>
-                <w:rFonts w:ascii="맑은 고딕" w:hAnsi="맑은 고딕" w:eastAsia="맑은 고딕"/>
-                <w:b w:val="0"/>
                 <w:sz w:val="18"/>
               </w:rPr>
               <w:t>$4.60M</w:t>
@@ -11938,8 +11409,6 @@
             </w:pPr>
             <w:r>
               <w:rPr>
-                <w:rFonts w:ascii="맑은 고딕" w:hAnsi="맑은 고딕" w:eastAsia="맑은 고딕"/>
-                <w:b w:val="0"/>
                 <w:sz w:val="18"/>
               </w:rPr>
               <w:t>$3.82M</w:t>
@@ -11960,12 +11429,8 @@
             <w:pPr>
               <w:jc w:val="center"/>
             </w:pPr>
-            <w:proofErr w:type="gramStart"/>
-            <w:proofErr w:type="gramEnd"/>
             <w:r>
               <w:rPr>
-                <w:rFonts w:ascii="맑은 고딕" w:hAnsi="맑은 고딕" w:eastAsia="맑은 고딕"/>
-                <w:b w:val="0"/>
                 <w:sz w:val="18"/>
               </w:rPr>
               <w:t>기업 계약 비중 확대</w:t>
@@ -11987,8 +11452,6 @@
           <w:p>
             <w:r>
               <w:rPr>
-                <w:rFonts w:ascii="맑은 고딕" w:hAnsi="맑은 고딕" w:eastAsia="맑은 고딕"/>
-                <w:b w:val="0"/>
                 <w:sz w:val="18"/>
               </w:rPr>
               <w:t>분기 흐름</w:t>
@@ -12011,8 +11474,6 @@
             </w:pPr>
             <w:r>
               <w:rPr>
-                <w:rFonts w:ascii="맑은 고딕" w:hAnsi="맑은 고딕" w:eastAsia="맑은 고딕"/>
-                <w:b w:val="0"/>
                 <w:sz w:val="18"/>
               </w:rPr>
               <w:t>27 Q1 $25K → 28 Q4 $1.25M</w:t>
@@ -12035,8 +11496,6 @@
             </w:pPr>
             <w:r>
               <w:rPr>
-                <w:rFonts w:ascii="맑은 고딕" w:hAnsi="맑은 고딕" w:eastAsia="맑은 고딕"/>
-                <w:b w:val="0"/>
                 <w:sz w:val="18"/>
               </w:rPr>
               <w:t>원가율 23.9% → 19.8%</w:t>
@@ -12059,8 +11518,6 @@
             </w:pPr>
             <w:r>
               <w:rPr>
-                <w:rFonts w:ascii="맑은 고딕" w:hAnsi="맑은 고딕" w:eastAsia="맑은 고딕"/>
-                <w:b w:val="0"/>
                 <w:sz w:val="18"/>
               </w:rPr>
               <w:t>총이익 확대</w:t>
@@ -12083,8 +11540,6 @@
             </w:pPr>
             <w:r>
               <w:rPr>
-                <w:rFonts w:ascii="맑은 고딕" w:hAnsi="맑은 고딕" w:eastAsia="맑은 고딕"/>
-                <w:b w:val="0"/>
                 <w:sz w:val="18"/>
               </w:rPr>
               <w:t>운영비 증가 반영</w:t>
@@ -12107,8 +11562,6 @@
             </w:pPr>
             <w:r>
               <w:rPr>
-                <w:rFonts w:ascii="맑은 고딕" w:hAnsi="맑은 고딕" w:eastAsia="맑은 고딕"/>
-                <w:b w:val="0"/>
                 <w:sz w:val="18"/>
               </w:rPr>
               <w:t>28년 Q2 손익분기 접근</w:t>
@@ -12129,12 +11582,8 @@
             <w:pPr>
               <w:jc w:val="center"/>
             </w:pPr>
-            <w:proofErr w:type="gramStart"/>
-            <w:proofErr w:type="gramEnd"/>
             <w:r>
               <w:rPr>
-                <w:rFonts w:ascii="맑은 고딕" w:hAnsi="맑은 고딕" w:eastAsia="맑은 고딕"/>
-                <w:b w:val="0"/>
                 <w:sz w:val="18"/>
               </w:rPr>
               <w:t>29년 본격 흑자</w:t>
@@ -12160,9 +11609,7 @@
       <w:bookmarkEnd w:id="34"/>
       <w:r>
         <w:rPr>
-          <w:rFonts w:ascii="맑은 고딕" w:hAnsi="맑은 고딕" w:eastAsia="맑은 고딕"/>
-          <w:b w:val="0"/>
-          <w:sz w:val="20"/>
+          <w:lang w:eastAsia="ko-KR"/>
         </w:rPr>
         <w:t>27년은 글로벌 오픈과 제품·GTM 보강을 위한 적자 구간이고, 28년 상반기에 손익분기점에 접근하며, 28년 하반기부터 흑자 전환을 목표로 한다.</w:t>
       </w:r>
@@ -12176,9 +11623,7 @@
       </w:pPr>
       <w:r>
         <w:rPr>
-          <w:rFonts w:ascii="맑은 고딕" w:hAnsi="맑은 고딕" w:eastAsia="맑은 고딕"/>
-          <w:b w:val="0"/>
-          <w:sz w:val="20"/>
+          <w:lang w:eastAsia="ko-KR"/>
         </w:rPr>
         <w:t>판관비에는 인건비, 마케팅, AM, 관리비가 포함되며, 팀형 계약과 기업 계약이 늘수록 이 비용도 함께 증가한다.</w:t>
       </w:r>
@@ -12192,10 +11637,9 @@
       </w:pPr>
       <w:r>
         <w:rPr>
-          <w:rFonts w:ascii="맑은 고딕" w:hAnsi="맑은 고딕" w:eastAsia="맑은 고딕"/>
-          <w:b w:val="0"/>
-          <w:sz w:val="20"/>
-        </w:rPr>
+          <w:lang w:eastAsia="ko-KR"/>
+        </w:rPr>
+        <w:lastRenderedPageBreak/>
         <w:t>팀 확장 기준은 27년 6명, 28년 10명, 29년 17명이다. 29년 $10.5M 매출을 유지하려면 제품·AI·운영·AM 기능이 함께 커져야 한다.</w:t>
       </w:r>
     </w:p>
@@ -12208,34 +11652,85 @@
       </w:pPr>
       <w:r>
         <w:rPr>
-          <w:rFonts w:ascii="맑은 고딕" w:hAnsi="맑은 고딕" w:eastAsia="맑은 고딕"/>
-          <w:b w:val="0"/>
-          <w:sz w:val="20"/>
-        </w:rPr>
-        <w:t>투자유치는 27년 하반기 브릿지·프리시드 5~7억원, 28년 하반기 시드 15~20억원을 전제로 하며, 29년 이후에는 영업흑자 구조를 바탕으로 선택적 후속 투자를 검토한다.</w:t>
+          <w:lang w:eastAsia="ko-KR"/>
+        </w:rPr>
+        <w:t xml:space="preserve">투자유치는 27년 하반기 </w:t>
+      </w:r>
+      <w:proofErr w:type="spellStart"/>
+      <w:r>
+        <w:rPr>
+          <w:lang w:eastAsia="ko-KR"/>
+        </w:rPr>
+        <w:t>브릿지</w:t>
+      </w:r>
+      <w:proofErr w:type="spellEnd"/>
+      <w:r>
+        <w:rPr>
+          <w:lang w:eastAsia="ko-KR"/>
+        </w:rPr>
+        <w:t>·</w:t>
+      </w:r>
+      <w:proofErr w:type="spellStart"/>
+      <w:r>
+        <w:rPr>
+          <w:lang w:eastAsia="ko-KR"/>
+        </w:rPr>
+        <w:t>프리시드</w:t>
+      </w:r>
+      <w:proofErr w:type="spellEnd"/>
+      <w:r>
+        <w:rPr>
+          <w:lang w:eastAsia="ko-KR"/>
+        </w:rPr>
+        <w:t xml:space="preserve"> 5~7억원, 28년 하반기 </w:t>
+      </w:r>
+      <w:proofErr w:type="spellStart"/>
+      <w:r>
+        <w:rPr>
+          <w:lang w:eastAsia="ko-KR"/>
+        </w:rPr>
+        <w:t>시드</w:t>
+      </w:r>
+      <w:proofErr w:type="spellEnd"/>
+      <w:r>
+        <w:rPr>
+          <w:lang w:eastAsia="ko-KR"/>
+        </w:rPr>
+        <w:t xml:space="preserve"> 15~20억원을 전제로 하며, 29년 이후에는 영업흑자 구조를 바탕으로 선택적 후속 투자를 검토한다.</w:t>
       </w:r>
     </w:p>
     <w:p>
       <w:pPr>
         <w:pStyle w:val="21"/>
+        <w:rPr>
+          <w:rFonts w:ascii="맑은 고딕" w:eastAsia="맑은 고딕" w:hAnsi="맑은 고딕"/>
+        </w:rPr>
       </w:pPr>
       <w:proofErr w:type="spellStart"/>
       <w:r>
         <w:rPr>
           <w:rFonts w:ascii="맑은 고딕" w:eastAsia="맑은 고딕" w:hAnsi="맑은 고딕" w:cs="맑은 고딕" w:hint="eastAsia"/>
         </w:rPr>
-        <w:lastRenderedPageBreak/>
         <w:t>출</w:t>
       </w:r>
       <w:r>
+        <w:rPr>
+          <w:rFonts w:ascii="맑은 고딕" w:eastAsia="맑은 고딕" w:hAnsi="맑은 고딕"/>
+        </w:rPr>
         <w:t>처</w:t>
       </w:r>
       <w:proofErr w:type="spellEnd"/>
       <w:r>
+        <w:rPr>
+          <w:rFonts w:ascii="맑은 고딕" w:eastAsia="맑은 고딕" w:hAnsi="맑은 고딕"/>
+        </w:rPr>
         <w:t xml:space="preserve"> </w:t>
       </w:r>
       <w:proofErr w:type="spellStart"/>
       <w:r>
+        <w:rPr>
+          <w:rFonts w:ascii="맑은 고딕" w:eastAsia="맑은 고딕" w:hAnsi="맑은 고딕"/>
+        </w:rPr>
         <w:t>종합</w:t>
       </w:r>
       <w:proofErr w:type="spellEnd"/>
@@ -12484,12 +11979,8 @@
             </w:tcBorders>
           </w:tcPr>
           <w:p>
-            <w:proofErr w:type="spellStart"/>
-            <w:proofErr w:type="spellEnd"/>
             <w:r>
               <w:rPr>
-                <w:rFonts w:ascii="맑은 고딕" w:hAnsi="맑은 고딕" w:eastAsia="맑은 고딕"/>
-                <w:b w:val="0"/>
                 <w:sz w:val="18"/>
               </w:rPr>
               <w:t>TechCrunch, SiliconANGLE, THE VC, Carta</w:t>
@@ -12509,8 +12000,6 @@
           <w:p>
             <w:r>
               <w:rPr>
-                <w:rFonts w:ascii="맑은 고딕" w:hAnsi="맑은 고딕" w:eastAsia="맑은 고딕"/>
-                <w:b w:val="0"/>
                 <w:sz w:val="18"/>
               </w:rPr>
               <w:t>1장, 7장</w:t>

</xml_diff>